<commit_message>
ISO W10: OPS-PRC-01 lolos r2; OPS-SOP-01, OPS-SOP-02 residu (gagal kedua, kembali ke bed1bb6)
Co-Authored-By: Claude Opus 5.5 <noreply@anthropic.com>
Claude-Session: https://claude.ai/code/session_01BhkCQM7h3krZb9kjY2Nate
</commit_message>
<xml_diff>
--- a/out/07_Ops/SNX-OPS-PRC-01 Operations Business Process Flow (Rev00 DRAFT).docx
+++ b/out/07_Ops/SNX-OPS-PRC-01 Operations Business Process Flow (Rev00 DRAFT).docx
@@ -217,6 +217,7 @@
     <w:p>
       <w:pPr>
         <w:pStyle w:val="Heading1"/>
+        <w:keepNext/>
         <w:widowControl w:val="0"/>
         <w:spacing w:line="240" w:lineRule="auto"/>
         <w:ind w:right="407" w:firstLine="0"/>
@@ -511,6 +512,10 @@
         <w:gridCol w:w="5850"/>
       </w:tblGrid>
       <w:tr>
+        <w:trPr>
+          <w:cantSplit/>
+          <w:tblHeader/>
+        </w:trPr>
         <w:tc>
           <w:tcPr>
             <w:tcW w:w="3150" w:type="dxa"/>
@@ -523,6 +528,7 @@
           </w:tcPr>
           <w:p>
             <w:pPr>
+              <w:keepNext/>
               <w:widowControl w:val="0"/>
               <w:pBdr>
                 <w:top w:val="nil"/>
@@ -563,6 +569,7 @@
           </w:tcPr>
           <w:p>
             <w:pPr>
+              <w:keepNext/>
               <w:widowControl w:val="0"/>
               <w:pBdr>
                 <w:top w:val="nil"/>
@@ -593,6 +600,9 @@
         </w:tc>
       </w:tr>
       <w:tr>
+        <w:trPr>
+          <w:cantSplit/>
+        </w:trPr>
         <w:tc>
           <w:tcPr>
             <w:tcW w:w="3150" w:type="dxa"/>
@@ -646,6 +656,9 @@
         </w:tc>
       </w:tr>
       <w:tr>
+        <w:trPr>
+          <w:cantSplit/>
+        </w:trPr>
         <w:tc>
           <w:tcPr>
             <w:tcW w:w="3150" w:type="dxa"/>
@@ -699,6 +712,9 @@
         </w:tc>
       </w:tr>
       <w:tr>
+        <w:trPr>
+          <w:cantSplit/>
+        </w:trPr>
         <w:tc>
           <w:tcPr>
             <w:tcW w:w="3150" w:type="dxa"/>
@@ -750,6 +766,9 @@
         </w:tc>
       </w:tr>
       <w:tr>
+        <w:trPr>
+          <w:cantSplit/>
+        </w:trPr>
         <w:tc>
           <w:tcPr>
             <w:tcW w:w="3150" w:type="dxa"/>
@@ -810,6 +829,9 @@
         </w:tc>
       </w:tr>
       <w:tr>
+        <w:trPr>
+          <w:cantSplit/>
+        </w:trPr>
         <w:tc>
           <w:tcPr>
             <w:tcW w:w="3150" w:type="dxa"/>
@@ -861,6 +883,9 @@
         </w:tc>
       </w:tr>
       <w:tr>
+        <w:trPr>
+          <w:cantSplit/>
+        </w:trPr>
         <w:tc>
           <w:tcPr>
             <w:tcW w:w="3150" w:type="dxa"/>
@@ -914,6 +939,9 @@
         </w:tc>
       </w:tr>
       <w:tr>
+        <w:trPr>
+          <w:cantSplit/>
+        </w:trPr>
         <w:tc>
           <w:tcPr>
             <w:tcW w:w="3150" w:type="dxa"/>
@@ -967,6 +995,9 @@
         </w:tc>
       </w:tr>
       <w:tr>
+        <w:trPr>
+          <w:cantSplit/>
+        </w:trPr>
         <w:tc>
           <w:tcPr>
             <w:tcW w:w="3150" w:type="dxa"/>
@@ -1020,6 +1051,9 @@
         </w:tc>
       </w:tr>
       <w:tr>
+        <w:trPr>
+          <w:cantSplit/>
+        </w:trPr>
         <w:tc>
           <w:tcPr>
             <w:tcW w:w="3150" w:type="dxa"/>
@@ -1073,6 +1107,9 @@
         </w:tc>
       </w:tr>
       <w:tr>
+        <w:trPr>
+          <w:cantSplit/>
+        </w:trPr>
         <w:tc>
           <w:tcPr>
             <w:tcW w:w="3150" w:type="dxa"/>
@@ -1126,6 +1163,9 @@
         </w:tc>
       </w:tr>
       <w:tr>
+        <w:trPr>
+          <w:cantSplit/>
+        </w:trPr>
         <w:tc>
           <w:tcPr>
             <w:tcW w:w="3150" w:type="dxa"/>
@@ -1207,6 +1247,7 @@
     <w:p>
       <w:pPr>
         <w:pStyle w:val="Heading1"/>
+        <w:keepNext/>
         <w:widowControl w:val="0"/>
         <w:spacing w:before="816" w:line="240" w:lineRule="auto"/>
         <w:ind w:right="407"/>
@@ -1243,6 +1284,10 @@
         <w:gridCol w:w="3010"/>
       </w:tblGrid>
       <w:tr>
+        <w:trPr>
+          <w:cantSplit/>
+          <w:tblHeader/>
+        </w:trPr>
         <w:tc>
           <w:tcPr>
             <w:tcW w:w="3009" w:type="dxa"/>
@@ -1255,6 +1300,7 @@
           </w:tcPr>
           <w:p>
             <w:pPr>
+              <w:keepNext/>
               <w:widowControl w:val="0"/>
               <w:spacing w:line="240" w:lineRule="auto"/>
               <w:jc w:val="center"/>
@@ -1288,6 +1334,7 @@
           </w:tcPr>
           <w:p>
             <w:pPr>
+              <w:keepNext/>
               <w:widowControl w:val="0"/>
               <w:spacing w:line="240" w:lineRule="auto"/>
               <w:jc w:val="center"/>
@@ -1321,6 +1368,7 @@
           </w:tcPr>
           <w:p>
             <w:pPr>
+              <w:keepNext/>
               <w:widowControl w:val="0"/>
               <w:spacing w:line="240" w:lineRule="auto"/>
               <w:jc w:val="center"/>
@@ -1344,6 +1392,9 @@
         </w:tc>
       </w:tr>
       <w:tr>
+        <w:trPr>
+          <w:cantSplit/>
+        </w:trPr>
         <w:tc>
           <w:tcPr>
             <w:tcW w:w="3009" w:type="dxa"/>
@@ -1392,6 +1443,9 @@
         </w:tc>
       </w:tr>
       <w:tr>
+        <w:trPr>
+          <w:cantSplit/>
+        </w:trPr>
         <w:tc>
           <w:tcPr>
             <w:tcW w:w="3009" w:type="dxa"/>
@@ -1463,6 +1517,9 @@
         </w:tc>
       </w:tr>
       <w:tr>
+        <w:trPr>
+          <w:cantSplit/>
+        </w:trPr>
         <w:tc>
           <w:tcPr>
             <w:tcW w:w="3009" w:type="dxa"/>
@@ -1537,6 +1594,7 @@
     <w:p>
       <w:pPr>
         <w:pStyle w:val="Heading1"/>
+        <w:keepNext/>
         <w:widowControl w:val="0"/>
         <w:spacing w:before="816" w:line="240" w:lineRule="auto"/>
         <w:ind w:right="407"/>
@@ -1578,6 +1636,10 @@
         <w:gridCol w:w="2235"/>
       </w:tblGrid>
       <w:tr>
+        <w:trPr>
+          <w:cantSplit/>
+          <w:tblHeader/>
+        </w:trPr>
         <w:tc>
           <w:tcPr>
             <w:tcW w:w="810" w:type="dxa"/>
@@ -1590,6 +1652,7 @@
           </w:tcPr>
           <w:p>
             <w:pPr>
+              <w:keepNext/>
               <w:widowControl w:val="0"/>
               <w:pBdr>
                 <w:top w:val="nil"/>
@@ -1630,6 +1693,7 @@
           </w:tcPr>
           <w:p>
             <w:pPr>
+              <w:keepNext/>
               <w:widowControl w:val="0"/>
               <w:spacing w:line="240" w:lineRule="auto"/>
               <w:jc w:val="center"/>
@@ -1663,6 +1727,7 @@
           </w:tcPr>
           <w:p>
             <w:pPr>
+              <w:keepNext/>
               <w:widowControl w:val="0"/>
               <w:pBdr>
                 <w:top w:val="nil"/>
@@ -1703,6 +1768,7 @@
           </w:tcPr>
           <w:p>
             <w:pPr>
+              <w:keepNext/>
               <w:widowControl w:val="0"/>
               <w:pBdr>
                 <w:top w:val="nil"/>
@@ -1733,6 +1799,9 @@
         </w:tc>
       </w:tr>
       <w:tr>
+        <w:trPr>
+          <w:cantSplit/>
+        </w:trPr>
         <w:tc>
           <w:tcPr>
             <w:tcW w:w="810" w:type="dxa"/>
@@ -1835,6 +1904,9 @@
         </w:tc>
       </w:tr>
       <w:tr>
+        <w:trPr>
+          <w:cantSplit/>
+        </w:trPr>
         <w:tc>
           <w:tcPr>
             <w:tcW w:w="810" w:type="dxa"/>
@@ -1937,6 +2009,9 @@
         </w:tc>
       </w:tr>
       <w:tr>
+        <w:trPr>
+          <w:cantSplit/>
+        </w:trPr>
         <w:tc>
           <w:tcPr>
             <w:tcW w:w="810" w:type="dxa"/>
@@ -2392,7 +2467,7 @@
           <w:sz w:val="24"/>
           <w:szCs w:val="24"/>
         </w:rPr>
-        <w:t xml:space="preserve">Dokumen ini memetakan proses bisnis Divisi Operation SINUX, dari kontrak ditandatangani sampai layanan berjalan, diukur, dan diperbaiki. Peta ini menjadi rujukan pendekatan proses ISO 9001:2015 klausul 4.4 dan perencanaan operasional ISO/IEC 27001:2022 klausul 8.1. Setiap tahap menyebut pemilik, input, output, dan rekaman yang menjadi bukti audit.</w:t>
+        <w:t xml:space="preserve">Dokumen ini memetakan proses bisnis Divisi Operation SINUX, dari kontrak ditandatangani sampai layanan berjalan, diukur, dan diperbaiki. Peta ini menjadi rujukan pendekatan proses ISO 9001:2015 klausul 4.4 dan perencanaan operasional ISO/IEC 27001:2022 klausul 8.1. Setiap tahap menyebut pemilik, input, output, dan record yang menjadi bukti audit.</w:t>
       </w:r>
     </w:p>
     <w:p>
@@ -2647,12 +2722,13 @@
           <w:sz w:val="24"/>
           <w:szCs w:val="24"/>
         </w:rPr>
-        <w:t xml:space="preserve">Sistem pendukung yang dipakai proses ini disebut di bagian 4.</w:t>
+        <w:t xml:space="preserve">Sistem pendukung proses ini adalah Nusametric, Overseer, console Nusagrid, Wazuh, AegisWAF, Cloudflare, EDR, Acronis Cyber Protect, Zammad, Service Hub, password manager (vault), Jumphost, dan Google Drive SINUX.</w:t>
       </w:r>
     </w:p>
     <w:p>
       <w:pPr>
         <w:pStyle w:val="Heading1"/>
+        <w:keepNext/>
         <w:numPr>
           <w:ilvl w:val="0"/>
           <w:numId w:val="7"/>
@@ -2687,6 +2763,8 @@
       </w:tblGrid>
       <w:tr>
         <w:trPr>
+          <w:cantSplit/>
+          <w:tblHeader/>
           <w:jc w:val="center"/>
         </w:trPr>
         <w:tc>
@@ -2696,6 +2774,7 @@
           </w:tcPr>
           <w:p>
             <w:pPr>
+              <w:keepNext/>
               <w:jc w:val="center"/>
               <w:rPr>
                 <w:sz w:val="24"/>
@@ -2720,6 +2799,7 @@
           </w:tcPr>
           <w:p>
             <w:pPr>
+              <w:keepNext/>
               <w:jc w:val="center"/>
               <w:rPr>
                 <w:sz w:val="24"/>
@@ -2740,6 +2820,7 @@
       </w:tr>
       <w:tr>
         <w:trPr>
+          <w:cantSplit/>
           <w:jc w:val="center"/>
         </w:trPr>
         <w:tc>
@@ -2782,13 +2863,14 @@
                 <w:sz w:val="24"/>
                 <w:szCs w:val="24"/>
               </w:rPr>
-              <w:t>Jabatan JA-02 pada SNX-HR-ORG-01. Dokumen ini selanjutnya menulis COO.</w:t>
+              <w:t>Jabatan JA-02 pada SNX-HR-ORG-01, dalam dokumen ini disebut COO.</w:t>
             </w:r>
           </w:p>
         </w:tc>
       </w:tr>
       <w:tr>
         <w:trPr>
+          <w:cantSplit/>
           <w:jc w:val="center"/>
         </w:trPr>
         <w:tc>
@@ -2838,6 +2920,7 @@
       </w:tr>
       <w:tr>
         <w:trPr>
+          <w:cantSplit/>
           <w:jc w:val="center"/>
         </w:trPr>
         <w:tc>
@@ -2880,13 +2963,14 @@
                 <w:sz w:val="24"/>
                 <w:szCs w:val="24"/>
               </w:rPr>
-              <w:t>Network Operations Center, sub divisi Operation yang memantau dashboard layanan dan menangani tiket.</w:t>
+              <w:t>Network Operations Center, sub divisi Operation yang memantau dashboard layanan dan menangani ticket.</w:t>
             </w:r>
           </w:p>
         </w:tc>
       </w:tr>
       <w:tr>
         <w:trPr>
+          <w:cantSplit/>
           <w:jc w:val="center"/>
         </w:trPr>
         <w:tc>
@@ -2936,6 +3020,7 @@
       </w:tr>
       <w:tr>
         <w:trPr>
+          <w:cantSplit/>
           <w:jc w:val="center"/>
         </w:trPr>
         <w:tc>
@@ -2985,6 +3070,7 @@
       </w:tr>
       <w:tr>
         <w:trPr>
+          <w:cantSplit/>
           <w:jc w:val="center"/>
         </w:trPr>
         <w:tc>
@@ -3034,6 +3120,7 @@
       </w:tr>
       <w:tr>
         <w:trPr>
+          <w:cantSplit/>
           <w:jc w:val="center"/>
         </w:trPr>
         <w:tc>
@@ -3076,13 +3163,14 @@
                 <w:sz w:val="24"/>
                 <w:szCs w:val="24"/>
               </w:rPr>
-              <w:t>Head of Operation, Lead NOC, Lead SOC, Service Delivery Manager, dan Project Manager. Status kelimanya (USULAN) di POL-OPS-001 dan SNX-HR-ORG-01, dan belum ada pemegang bernama.</w:t>
+              <w:t>Head of Operation, Lead NOC, Lead SOC, Service Delivery Manager, dan Project Manager. Kelimanya belum punya pemegang bernama dan masih berstatus usulan di POL-OPS-001 dan SNX-HR-ORG-01 (USULAN).</w:t>
             </w:r>
           </w:p>
         </w:tc>
       </w:tr>
       <w:tr>
         <w:trPr>
+          <w:cantSplit/>
           <w:jc w:val="center"/>
         </w:trPr>
         <w:tc>
@@ -3132,6 +3220,7 @@
       </w:tr>
       <w:tr>
         <w:trPr>
+          <w:cantSplit/>
           <w:jc w:val="center"/>
         </w:trPr>
         <w:tc>
@@ -3181,6 +3270,7 @@
       </w:tr>
       <w:tr>
         <w:trPr>
+          <w:cantSplit/>
           <w:jc w:val="center"/>
         </w:trPr>
         <w:tc>
@@ -3223,13 +3313,14 @@
                 <w:sz w:val="24"/>
                 <w:szCs w:val="24"/>
               </w:rPr>
-              <w:t>Proses sistem manajemen keamanan informasi (ISMS) yang berjalan bersama proses inti. Daftarnya ada di tabel Dokumen terkait.</w:t>
+              <w:t>Proses sistem manajemen keamanan informasi (ISMS) yang berjalan bersama proses inti. Daftarnya tercantum di tabel Dokumen terkait.</w:t>
             </w:r>
           </w:p>
         </w:tc>
       </w:tr>
       <w:tr>
         <w:trPr>
+          <w:cantSplit/>
           <w:jc w:val="center"/>
         </w:trPr>
         <w:tc>
@@ -3272,13 +3363,14 @@
                 <w:sz w:val="24"/>
                 <w:szCs w:val="24"/>
               </w:rPr>
-              <w:t>Uraian tiap proses inti yang memuat pemilik, input, output, pelanggan proses, prosedur, dan rekaman bukti.</w:t>
+              <w:t>Uraian tiap proses inti yang memuat pemilik, input, output, pelanggan proses, prosedur, dan record bukti.</w:t>
             </w:r>
           </w:p>
         </w:tc>
       </w:tr>
       <w:tr>
         <w:trPr>
+          <w:cantSplit/>
           <w:jc w:val="center"/>
         </w:trPr>
         <w:tc>
@@ -3328,6 +3420,7 @@
       </w:tr>
       <w:tr>
         <w:trPr>
+          <w:cantSplit/>
           <w:jc w:val="center"/>
         </w:trPr>
         <w:tc>
@@ -3377,6 +3470,7 @@
       </w:tr>
       <w:tr>
         <w:trPr>
+          <w:cantSplit/>
           <w:jc w:val="center"/>
         </w:trPr>
         <w:tc>
@@ -3426,6 +3520,7 @@
       </w:tr>
       <w:tr>
         <w:trPr>
+          <w:cantSplit/>
           <w:jc w:val="center"/>
         </w:trPr>
         <w:tc>
@@ -3475,6 +3570,7 @@
       </w:tr>
       <w:tr>
         <w:trPr>
+          <w:cantSplit/>
           <w:jc w:val="center"/>
         </w:trPr>
         <w:tc>
@@ -3524,6 +3620,7 @@
       </w:tr>
       <w:tr>
         <w:trPr>
+          <w:cantSplit/>
           <w:jc w:val="center"/>
         </w:trPr>
         <w:tc>
@@ -3573,6 +3670,7 @@
       </w:tr>
       <w:tr>
         <w:trPr>
+          <w:cantSplit/>
           <w:jc w:val="center"/>
         </w:trPr>
         <w:tc>
@@ -3622,6 +3720,7 @@
       </w:tr>
       <w:tr>
         <w:trPr>
+          <w:cantSplit/>
           <w:jc w:val="center"/>
         </w:trPr>
         <w:tc>
@@ -3664,13 +3763,14 @@
                 <w:sz w:val="24"/>
                 <w:szCs w:val="24"/>
               </w:rPr>
-              <w:t>Berkas yang Commercial serahkan ke SD dan PM pada G1.</w:t>
+              <w:t>Berkas yang diserahkan Commercial ke SD dan PM pada G1.</w:t>
             </w:r>
           </w:p>
         </w:tc>
       </w:tr>
       <w:tr>
         <w:trPr>
+          <w:cantSplit/>
           <w:jc w:val="center"/>
         </w:trPr>
         <w:tc>
@@ -3720,6 +3820,7 @@
       </w:tr>
       <w:tr>
         <w:trPr>
+          <w:cantSplit/>
           <w:jc w:val="center"/>
         </w:trPr>
         <w:tc>
@@ -3769,6 +3870,7 @@
       </w:tr>
       <w:tr>
         <w:trPr>
+          <w:cantSplit/>
           <w:jc w:val="center"/>
         </w:trPr>
         <w:tc>
@@ -3818,6 +3920,7 @@
       </w:tr>
       <w:tr>
         <w:trPr>
+          <w:cantSplit/>
           <w:jc w:val="center"/>
         </w:trPr>
         <w:tc>
@@ -3867,6 +3970,7 @@
       </w:tr>
       <w:tr>
         <w:trPr>
+          <w:cantSplit/>
           <w:jc w:val="center"/>
         </w:trPr>
         <w:tc>
@@ -3909,13 +4013,14 @@
                 <w:sz w:val="24"/>
                 <w:szCs w:val="24"/>
               </w:rPr>
-              <w:t>Root cause analysis, analisis akar penyebab sebuah insiden.</w:t>
+              <w:t>Root cause analysis, analisis untuk menemukan root cause (akar masalah) sebuah insiden.</w:t>
             </w:r>
           </w:p>
         </w:tc>
       </w:tr>
       <w:tr>
         <w:trPr>
+          <w:cantSplit/>
           <w:jc w:val="center"/>
         </w:trPr>
         <w:tc>
@@ -3958,13 +4063,14 @@
                 <w:sz w:val="24"/>
                 <w:szCs w:val="24"/>
               </w:rPr>
-              <w:t>Dua tingkat severity tertinggi pada tiket, P1 Kritis dan P2 Tinggi, dari skala P1 sampai P4 di POL-OPS-001.</w:t>
+              <w:t>Dua tingkat severity tertinggi pada ticket, P1 Kritis dan P2 Tinggi, dari skala P1 sampai P4 di POL-OPS-001.</w:t>
             </w:r>
           </w:p>
         </w:tc>
       </w:tr>
       <w:tr>
         <w:trPr>
+          <w:cantSplit/>
           <w:jc w:val="center"/>
         </w:trPr>
         <w:tc>
@@ -4007,13 +4113,14 @@
                 <w:sz w:val="24"/>
                 <w:szCs w:val="24"/>
               </w:rPr>
-              <w:t>Sistem tiket untuk Operation.</w:t>
+              <w:t>Sistem ticket untuk Operation.</w:t>
             </w:r>
           </w:p>
         </w:tc>
       </w:tr>
       <w:tr>
         <w:trPr>
+          <w:cantSplit/>
           <w:jc w:val="center"/>
         </w:trPr>
         <w:tc>
@@ -4056,13 +4163,14 @@
                 <w:sz w:val="24"/>
                 <w:szCs w:val="24"/>
               </w:rPr>
-              <w:t>SINUX Service Hub berbasis GLPI (ticket.sinux.co.id), sistem tiket untuk generalist.</w:t>
+              <w:t>SINUX Service Hub berbasis GLPI (ticket.sinux.co.id), sistem ticket untuk generalist.</w:t>
             </w:r>
           </w:p>
         </w:tc>
       </w:tr>
       <w:tr>
         <w:trPr>
+          <w:cantSplit/>
           <w:jc w:val="center"/>
         </w:trPr>
         <w:tc>
@@ -4112,6 +4220,7 @@
       </w:tr>
       <w:tr>
         <w:trPr>
+          <w:cantSplit/>
           <w:jc w:val="center"/>
         </w:trPr>
         <w:tc>
@@ -4161,6 +4270,7 @@
       </w:tr>
       <w:tr>
         <w:trPr>
+          <w:cantSplit/>
           <w:jc w:val="center"/>
         </w:trPr>
         <w:tc>
@@ -4261,7 +4371,7 @@
           <w:sz w:val="24"/>
           <w:szCs w:val="24"/>
         </w:rPr>
-        <w:t xml:space="preserve">Setiap proses inti punya pemilik proses yang bertanggung jawab atas kinerja dan dokumennya. Pemilik tiap proses tercantum di butir 6.1 (ISO 9001:2015 4.4; ISO/IEC 27001:2022 4.4).</w:t>
+        <w:t xml:space="preserve">Setiap proses inti punya pemilik proses yang bertanggung jawab atas kinerja dan dokumennya (ISO 9001:2015 4.4; ISO/IEC 27001:2022 4.4).</w:t>
       </w:r>
     </w:p>
     <w:p>
@@ -4309,7 +4419,7 @@
           <w:sz w:val="24"/>
           <w:szCs w:val="24"/>
         </w:rPr>
-        <w:t xml:space="preserve">Operation berhak menolak serah terima G3 secara tertulis bila Checklist G3 belum lengkap. Selama G3 belum lolos, layanan berstatus hypercare dengan pemilik SD dan PM (ISO 9001:2015 8.6).</w:t>
+        <w:t xml:space="preserve">Operation berhak menolak serah terima G3 secara tertulis jika Checklist G3 belum lengkap. Selama G3 belum lolos, layanan berstatus hypercare dengan pemilik SD dan PM (ISO 9001:2015 8.6).</w:t>
       </w:r>
     </w:p>
     <w:p>
@@ -4357,7 +4467,7 @@
           <w:sz w:val="24"/>
           <w:szCs w:val="24"/>
         </w:rPr>
-        <w:t xml:space="preserve">Layanan dinyatakan BAU hanya setelah G3 lolos, dan perubahan konfigurasi dijalankan lewat change request menurut SNX-OPS-SOP-02 (ISO 9001:2015 8.5).</w:t>
+        <w:t xml:space="preserve">Layanan dinyatakan BAU hanya setelah G3 lolos, dan perubahan konfigurasi dijalankan melalui change request menurut SNX-OPS-SOP-02 (ISO 9001:2015 8.5).</w:t>
       </w:r>
     </w:p>
     <w:p>
@@ -4429,7 +4539,7 @@
           <w:sz w:val="24"/>
           <w:szCs w:val="24"/>
         </w:rPr>
-        <w:t xml:space="preserve">Tiket pelanggan Nusagrid dicatat di Zammad. Tiket GMF dedicated dan permintaan internal dicatat di Service Hub. Change request dan Shift Log dicatat di Service Hub (USULAN). Batas pemakaian dengan Zammad belum diputus.</w:t>
+        <w:t xml:space="preserve">Ticket pelanggan Nusagrid dicatat di Zammad. Ticket GMF dedicated dan permintaan internal dicatat di Service Hub. Change request dan Shift Log dicatat di Service Hub, sedangkan batas pemakaiannya dengan Zammad belum diputus (USULAN).</w:t>
       </w:r>
     </w:p>
     <w:p>
@@ -4453,7 +4563,7 @@
           <w:sz w:val="24"/>
           <w:szCs w:val="24"/>
         </w:rPr>
-        <w:t xml:space="preserve">Kredensial dilarang ditulis di chat, tiket, atau dokumen. Kredensial disimpan di password manager (vault).</w:t>
+        <w:t xml:space="preserve">Kredensial dilarang ditulis di chat, ticket, atau dokumen. Kredensial disimpan di password manager (vault).</w:t>
       </w:r>
     </w:p>
     <w:p>
@@ -4477,7 +4587,7 @@
           <w:sz w:val="24"/>
           <w:szCs w:val="24"/>
         </w:rPr>
-        <w:t xml:space="preserve">Akses production lewat Jumphost SINUX, yang merekam sesi untuk audit akses.</w:t>
+        <w:t xml:space="preserve">Akses ke production dilakukan melalui Jumphost SINUX, yang merekam sesi untuk audit akses.</w:t>
       </w:r>
     </w:p>
     <w:p>
@@ -4501,12 +4611,13 @@
           <w:sz w:val="24"/>
           <w:szCs w:val="24"/>
         </w:rPr>
-        <w:t xml:space="preserve">Dokumen dan rekaman disimpan di Google Drive SINUX dan dikendalikan sesuai SNX-ISMS-PRO-01. Rekaman mengikuti masa simpan di dokumennya masing-masing.</w:t>
+        <w:t xml:space="preserve">Dokumen dan record disimpan di Google Drive SINUX dan dikendalikan sesuai SNX-ISMS-PRO-01. Record mengikuti masa simpan di dokumennya masing-masing.</w:t>
       </w:r>
     </w:p>
     <w:p>
       <w:pPr>
         <w:pStyle w:val="Heading1"/>
+        <w:keepNext/>
         <w:numPr>
           <w:ilvl w:val="0"/>
           <w:numId w:val="7"/>
@@ -4534,6 +4645,8 @@
       </w:tblGrid>
       <w:tr>
         <w:trPr>
+          <w:cantSplit/>
+          <w:tblHeader/>
           <w:jc w:val="center"/>
         </w:trPr>
         <w:tc>
@@ -4550,6 +4663,7 @@
           </w:tcPr>
           <w:p>
             <w:pPr>
+              <w:keepNext/>
               <w:jc w:val="center"/>
               <w:rPr>
                 <w:sz w:val="24"/>
@@ -4581,6 +4695,7 @@
           </w:tcPr>
           <w:p>
             <w:pPr>
+              <w:keepNext/>
               <w:jc w:val="center"/>
               <w:rPr>
                 <w:sz w:val="24"/>
@@ -4612,6 +4727,7 @@
           </w:tcPr>
           <w:p>
             <w:pPr>
+              <w:keepNext/>
               <w:jc w:val="center"/>
               <w:rPr>
                 <w:sz w:val="24"/>
@@ -4632,6 +4748,7 @@
       </w:tr>
       <w:tr>
         <w:trPr>
+          <w:cantSplit/>
           <w:jc w:val="center"/>
         </w:trPr>
         <w:tc>
@@ -4677,19 +4794,19 @@
           </w:tcPr>
           <w:p>
             <w:pPr>
-              <w:jc w:val="both"/>
-              <w:rPr>
-                <w:sz w:val="24"/>
-                <w:szCs w:val="24"/>
-              </w:rPr>
-            </w:pPr>
-            <w:r>
-              <w:rPr>
-                <w:b w:val="0"/>
-                <w:sz w:val="24"/>
-                <w:szCs w:val="24"/>
-              </w:rPr>
-              <w:t>Memimpin tinjauan manajemen yang membahas hasil pengukuran kinerja proses.</w:t>
+              <w:jc w:val="left"/>
+              <w:rPr>
+                <w:sz w:val="24"/>
+                <w:szCs w:val="24"/>
+              </w:rPr>
+            </w:pPr>
+            <w:r>
+              <w:rPr>
+                <w:b w:val="0"/>
+                <w:sz w:val="24"/>
+                <w:szCs w:val="24"/>
+              </w:rPr>
+              <w:t>Memimpin Management Review yang membahas hasil pengukuran kinerja proses.</w:t>
             </w:r>
           </w:p>
         </w:tc>
@@ -4707,25 +4824,26 @@
           </w:tcPr>
           <w:p>
             <w:pPr>
-              <w:jc w:val="both"/>
-              <w:rPr>
-                <w:sz w:val="24"/>
-                <w:szCs w:val="24"/>
-              </w:rPr>
-            </w:pPr>
-            <w:r>
-              <w:rPr>
-                <w:b w:val="0"/>
-                <w:sz w:val="24"/>
-                <w:szCs w:val="24"/>
-              </w:rPr>
-              <w:t>Menyetujui dokumen ini lewat blok Approved By.</w:t>
+              <w:jc w:val="left"/>
+              <w:rPr>
+                <w:sz w:val="24"/>
+                <w:szCs w:val="24"/>
+              </w:rPr>
+            </w:pPr>
+            <w:r>
+              <w:rPr>
+                <w:b w:val="0"/>
+                <w:sz w:val="24"/>
+                <w:szCs w:val="24"/>
+              </w:rPr>
+              <w:t>Menyetujui dokumen ini melalui blok Approved By.</w:t>
             </w:r>
           </w:p>
         </w:tc>
       </w:tr>
       <w:tr>
         <w:trPr>
+          <w:cantSplit/>
           <w:jc w:val="center"/>
         </w:trPr>
         <w:tc>
@@ -4771,7 +4889,7 @@
           </w:tcPr>
           <w:p>
             <w:pPr>
-              <w:jc w:val="both"/>
+              <w:jc w:val="left"/>
               <w:rPr>
                 <w:sz w:val="24"/>
                 <w:szCs w:val="24"/>
@@ -4801,7 +4919,7 @@
           </w:tcPr>
           <w:p>
             <w:pPr>
-              <w:jc w:val="both"/>
+              <w:jc w:val="left"/>
               <w:rPr>
                 <w:sz w:val="24"/>
                 <w:szCs w:val="24"/>
@@ -4820,6 +4938,7 @@
       </w:tr>
       <w:tr>
         <w:trPr>
+          <w:cantSplit/>
           <w:jc w:val="center"/>
         </w:trPr>
         <w:tc>
@@ -4865,7 +4984,7 @@
           </w:tcPr>
           <w:p>
             <w:pPr>
-              <w:jc w:val="both"/>
+              <w:jc w:val="left"/>
               <w:rPr>
                 <w:sz w:val="24"/>
                 <w:szCs w:val="24"/>
@@ -4895,7 +5014,7 @@
           </w:tcPr>
           <w:p>
             <w:pPr>
-              <w:jc w:val="both"/>
+              <w:jc w:val="left"/>
               <w:rPr>
                 <w:sz w:val="24"/>
                 <w:szCs w:val="24"/>
@@ -4914,6 +5033,7 @@
       </w:tr>
       <w:tr>
         <w:trPr>
+          <w:cantSplit/>
           <w:jc w:val="center"/>
         </w:trPr>
         <w:tc>
@@ -4959,7 +5079,7 @@
           </w:tcPr>
           <w:p>
             <w:pPr>
-              <w:jc w:val="both"/>
+              <w:jc w:val="left"/>
               <w:rPr>
                 <w:sz w:val="24"/>
                 <w:szCs w:val="24"/>
@@ -4989,25 +5109,26 @@
           </w:tcPr>
           <w:p>
             <w:pPr>
-              <w:jc w:val="both"/>
-              <w:rPr>
-                <w:sz w:val="24"/>
-                <w:szCs w:val="24"/>
-              </w:rPr>
-            </w:pPr>
-            <w:r>
-              <w:rPr>
-                <w:b w:val="0"/>
-                <w:sz w:val="24"/>
-                <w:szCs w:val="24"/>
-              </w:rPr>
-              <w:t>Menerima paket handover G1 bila Checklist G1 terpenuhi.</w:t>
+              <w:jc w:val="left"/>
+              <w:rPr>
+                <w:sz w:val="24"/>
+                <w:szCs w:val="24"/>
+              </w:rPr>
+            </w:pPr>
+            <w:r>
+              <w:rPr>
+                <w:b w:val="0"/>
+                <w:sz w:val="24"/>
+                <w:szCs w:val="24"/>
+              </w:rPr>
+              <w:t>Menerima paket handover G1 jika Checklist G1 terpenuhi.</w:t>
             </w:r>
           </w:p>
         </w:tc>
       </w:tr>
       <w:tr>
         <w:trPr>
+          <w:cantSplit/>
           <w:jc w:val="center"/>
         </w:trPr>
         <w:tc>
@@ -5053,7 +5174,7 @@
           </w:tcPr>
           <w:p>
             <w:pPr>
-              <w:jc w:val="both"/>
+              <w:jc w:val="left"/>
               <w:rPr>
                 <w:sz w:val="24"/>
                 <w:szCs w:val="24"/>
@@ -5083,25 +5204,26 @@
           </w:tcPr>
           <w:p>
             <w:pPr>
-              <w:jc w:val="both"/>
-              <w:rPr>
-                <w:sz w:val="24"/>
-                <w:szCs w:val="24"/>
-              </w:rPr>
-            </w:pPr>
-            <w:r>
-              <w:rPr>
-                <w:b w:val="0"/>
-                <w:sz w:val="24"/>
-                <w:szCs w:val="24"/>
-              </w:rPr>
-              <w:t>Menyatakan G2 lolos bila syaratnya terpenuhi.</w:t>
+              <w:jc w:val="left"/>
+              <w:rPr>
+                <w:sz w:val="24"/>
+                <w:szCs w:val="24"/>
+              </w:rPr>
+            </w:pPr>
+            <w:r>
+              <w:rPr>
+                <w:b w:val="0"/>
+                <w:sz w:val="24"/>
+                <w:szCs w:val="24"/>
+              </w:rPr>
+              <w:t>Menyatakan G2 lolos jika syaratnya terpenuhi.</w:t>
             </w:r>
           </w:p>
         </w:tc>
       </w:tr>
       <w:tr>
         <w:trPr>
+          <w:cantSplit/>
           <w:jc w:val="center"/>
         </w:trPr>
         <w:tc>
@@ -5147,7 +5269,7 @@
           </w:tcPr>
           <w:p>
             <w:pPr>
-              <w:jc w:val="both"/>
+              <w:jc w:val="left"/>
               <w:rPr>
                 <w:sz w:val="24"/>
                 <w:szCs w:val="24"/>
@@ -5177,7 +5299,7 @@
           </w:tcPr>
           <w:p>
             <w:pPr>
-              <w:jc w:val="both"/>
+              <w:jc w:val="left"/>
               <w:rPr>
                 <w:sz w:val="24"/>
                 <w:szCs w:val="24"/>
@@ -5196,6 +5318,7 @@
       </w:tr>
       <w:tr>
         <w:trPr>
+          <w:cantSplit/>
           <w:jc w:val="center"/>
         </w:trPr>
         <w:tc>
@@ -5241,7 +5364,7 @@
           </w:tcPr>
           <w:p>
             <w:pPr>
-              <w:jc w:val="both"/>
+              <w:jc w:val="left"/>
               <w:rPr>
                 <w:sz w:val="24"/>
                 <w:szCs w:val="24"/>
@@ -5271,7 +5394,7 @@
           </w:tcPr>
           <w:p>
             <w:pPr>
-              <w:jc w:val="both"/>
+              <w:jc w:val="left"/>
               <w:rPr>
                 <w:sz w:val="24"/>
                 <w:szCs w:val="24"/>
@@ -5290,6 +5413,7 @@
       </w:tr>
       <w:tr>
         <w:trPr>
+          <w:cantSplit/>
           <w:jc w:val="center"/>
         </w:trPr>
         <w:tc>
@@ -5335,7 +5459,7 @@
           </w:tcPr>
           <w:p>
             <w:pPr>
-              <w:jc w:val="both"/>
+              <w:jc w:val="left"/>
               <w:rPr>
                 <w:sz w:val="24"/>
                 <w:szCs w:val="24"/>
@@ -5365,7 +5489,7 @@
           </w:tcPr>
           <w:p>
             <w:pPr>
-              <w:jc w:val="both"/>
+              <w:jc w:val="left"/>
               <w:rPr>
                 <w:sz w:val="24"/>
                 <w:szCs w:val="24"/>
@@ -5384,6 +5508,7 @@
       </w:tr>
       <w:tr>
         <w:trPr>
+          <w:cantSplit/>
           <w:jc w:val="center"/>
         </w:trPr>
         <w:tc>
@@ -5429,19 +5554,19 @@
           </w:tcPr>
           <w:p>
             <w:pPr>
-              <w:jc w:val="both"/>
-              <w:rPr>
-                <w:sz w:val="24"/>
-                <w:szCs w:val="24"/>
-              </w:rPr>
-            </w:pPr>
-            <w:r>
-              <w:rPr>
-                <w:b w:val="0"/>
-                <w:sz w:val="24"/>
-                <w:szCs w:val="24"/>
-              </w:rPr>
-              <w:t>Bertanggung jawab atas kinerja dan dokumen proses yang dimilikinya (butir 6.1).</w:t>
+              <w:jc w:val="left"/>
+              <w:rPr>
+                <w:sz w:val="24"/>
+                <w:szCs w:val="24"/>
+              </w:rPr>
+            </w:pPr>
+            <w:r>
+              <w:rPr>
+                <w:b w:val="0"/>
+                <w:sz w:val="24"/>
+                <w:szCs w:val="24"/>
+              </w:rPr>
+              <w:t>Bertanggung jawab atas kinerja dan dokumen proses inti yang dimilikinya.</w:t>
             </w:r>
           </w:p>
         </w:tc>
@@ -5459,7 +5584,7 @@
           </w:tcPr>
           <w:p>
             <w:pPr>
-              <w:jc w:val="both"/>
+              <w:jc w:val="left"/>
               <w:rPr>
                 <w:sz w:val="24"/>
                 <w:szCs w:val="24"/>
@@ -5544,11 +5669,12 @@
           <w:sz w:val="24"/>
           <w:szCs w:val="24"/>
         </w:rPr>
-        <w:t xml:space="preserve">Uraian proses (SIPOC) memuat pemilik proses, input, output, pelanggan proses, prosedur, dan rekaman bukti. Nomor langkah sama dengan nomor proses. Kolom PIC berisi pemilik proses, dan kolom Output / Rekaman berisi rekaman bukti serta pelanggan proses.</w:t>
+        <w:t xml:space="preserve">Uraian proses (SIPOC) memuat pemilik proses, input, output, pelanggan proses, prosedur, dan record bukti. Nomor langkah sama dengan nomor proses. Kolom PIC berisi pemilik proses, dan kolom Output / Rekaman berisi record bukti serta pelanggan proses.</w:t>
       </w:r>
     </w:p>
     <w:p>
       <w:pPr>
+        <w:keepNext/>
         <w:pBdr>
           <w:top w:val="nil"/>
           <w:left w:val="nil"/>
@@ -5568,7 +5694,7 @@
           <w:sz w:val="24"/>
           <w:szCs w:val="24"/>
         </w:rPr>
-        <w:t xml:space="preserve">Pemilik proses 4 adalah Service Delivery Manager, sedangkan pemilik gate G2 dan G3 ada di butir 6.2.</w:t>
+        <w:t xml:space="preserve">Pemilik proses 4 adalah Service Delivery Manager, sedangkan pemilik gate G2 adalah Project Manager dan pemilik gate G3 adalah Head of Operation.</w:t>
       </w:r>
     </w:p>
     <w:tbl>
@@ -5581,17 +5707,19 @@
         <w:tblLook w:val="0400" w:firstRow="0" w:lastRow="0" w:firstColumn="0" w:lastColumn="0" w:noHBand="0" w:noVBand="1"/>
       </w:tblPr>
       <w:tblGrid>
-        <w:gridCol w:w="3367"/>
-        <w:gridCol w:w="2248"/>
-        <w:gridCol w:w="3913"/>
+        <w:gridCol w:w="4309"/>
+        <w:gridCol w:w="1927"/>
+        <w:gridCol w:w="2835"/>
       </w:tblGrid>
       <w:tr>
         <w:trPr>
+          <w:cantSplit/>
+          <w:tblHeader/>
           <w:jc w:val="center"/>
         </w:trPr>
         <w:tc>
           <w:tcPr>
-            <w:tcW w:w="3367" w:type="dxa"/>
+            <w:tcW w:w="4309" w:type="dxa"/>
             <w:tcBorders>
               <w:top w:val="single" w:sz="8" w:space="0" w:color="000000"/>
               <w:left w:val="single" w:sz="8" w:space="0" w:color="000000"/>
@@ -5602,6 +5730,7 @@
           </w:tcPr>
           <w:p>
             <w:pPr>
+              <w:keepNext/>
               <w:jc w:val="center"/>
               <w:rPr>
                 <w:sz w:val="24"/>
@@ -5621,7 +5750,7 @@
         </w:tc>
         <w:tc>
           <w:tcPr>
-            <w:tcW w:w="2248" w:type="dxa"/>
+            <w:tcW w:w="1927" w:type="dxa"/>
             <w:tcBorders>
               <w:top w:val="single" w:sz="8" w:space="0" w:color="000000"/>
               <w:left w:val="single" w:sz="8" w:space="0" w:color="000000"/>
@@ -5632,6 +5761,7 @@
           </w:tcPr>
           <w:p>
             <w:pPr>
+              <w:keepNext/>
               <w:jc w:val="center"/>
               <w:rPr>
                 <w:sz w:val="24"/>
@@ -5651,7 +5781,7 @@
         </w:tc>
         <w:tc>
           <w:tcPr>
-            <w:tcW w:w="3913" w:type="dxa"/>
+            <w:tcW w:w="2835" w:type="dxa"/>
             <w:tcBorders>
               <w:top w:val="single" w:sz="8" w:space="0" w:color="000000"/>
               <w:left w:val="single" w:sz="8" w:space="0" w:color="000000"/>
@@ -5662,6 +5792,7 @@
           </w:tcPr>
           <w:p>
             <w:pPr>
+              <w:keepNext/>
               <w:jc w:val="center"/>
               <w:rPr>
                 <w:sz w:val="24"/>
@@ -5682,11 +5813,12 @@
       </w:tr>
       <w:tr>
         <w:trPr>
+          <w:cantSplit/>
           <w:jc w:val="center"/>
         </w:trPr>
         <w:tc>
           <w:tcPr>
-            <w:tcW w:w="3367" w:type="dxa"/>
+            <w:tcW w:w="4309" w:type="dxa"/>
             <w:tcBorders>
               <w:top w:val="single" w:sz="8" w:space="0" w:color="000000"/>
               <w:left w:val="single" w:sz="8" w:space="0" w:color="000000"/>
@@ -5714,7 +5846,7 @@
         </w:tc>
         <w:tc>
           <w:tcPr>
-            <w:tcW w:w="2248" w:type="dxa"/>
+            <w:tcW w:w="1927" w:type="dxa"/>
             <w:tcBorders>
               <w:top w:val="single" w:sz="8" w:space="0" w:color="000000"/>
               <w:left w:val="single" w:sz="8" w:space="0" w:color="000000"/>
@@ -5742,7 +5874,7 @@
         </w:tc>
         <w:tc>
           <w:tcPr>
-            <w:tcW w:w="3913" w:type="dxa"/>
+            <w:tcW w:w="2835" w:type="dxa"/>
             <w:tcBorders>
               <w:top w:val="single" w:sz="8" w:space="0" w:color="000000"/>
               <w:left w:val="single" w:sz="8" w:space="0" w:color="000000"/>
@@ -5753,30 +5885,31 @@
           </w:tcPr>
           <w:p>
             <w:pPr>
-              <w:jc w:val="both"/>
-              <w:rPr>
-                <w:sz w:val="24"/>
-                <w:szCs w:val="24"/>
-              </w:rPr>
-            </w:pPr>
-            <w:r>
-              <w:rPr>
-                <w:b w:val="0"/>
-                <w:sz w:val="24"/>
-                <w:szCs w:val="24"/>
-              </w:rPr>
-              <w:t>Rekaman: kontrak dan paket handover G1. Pelanggan proses: SD dan PM.</w:t>
+              <w:jc w:val="left"/>
+              <w:rPr>
+                <w:sz w:val="24"/>
+                <w:szCs w:val="24"/>
+              </w:rPr>
+            </w:pPr>
+            <w:r>
+              <w:rPr>
+                <w:b w:val="0"/>
+                <w:sz w:val="24"/>
+                <w:szCs w:val="24"/>
+              </w:rPr>
+              <w:t>Record: kontrak dan paket handover G1. Pelanggan proses: SD dan PM.</w:t>
             </w:r>
           </w:p>
         </w:tc>
       </w:tr>
       <w:tr>
         <w:trPr>
+          <w:cantSplit/>
           <w:jc w:val="center"/>
         </w:trPr>
         <w:tc>
           <w:tcPr>
-            <w:tcW w:w="3367" w:type="dxa"/>
+            <w:tcW w:w="4309" w:type="dxa"/>
             <w:tcBorders>
               <w:top w:val="single" w:sz="8" w:space="0" w:color="000000"/>
               <w:left w:val="single" w:sz="8" w:space="0" w:color="000000"/>
@@ -5804,7 +5937,7 @@
         </w:tc>
         <w:tc>
           <w:tcPr>
-            <w:tcW w:w="2248" w:type="dxa"/>
+            <w:tcW w:w="1927" w:type="dxa"/>
             <w:tcBorders>
               <w:top w:val="single" w:sz="8" w:space="0" w:color="000000"/>
               <w:left w:val="single" w:sz="8" w:space="0" w:color="000000"/>
@@ -5832,7 +5965,7 @@
         </w:tc>
         <w:tc>
           <w:tcPr>
-            <w:tcW w:w="3913" w:type="dxa"/>
+            <w:tcW w:w="2835" w:type="dxa"/>
             <w:tcBorders>
               <w:top w:val="single" w:sz="8" w:space="0" w:color="000000"/>
               <w:left w:val="single" w:sz="8" w:space="0" w:color="000000"/>
@@ -5843,30 +5976,31 @@
           </w:tcPr>
           <w:p>
             <w:pPr>
-              <w:jc w:val="both"/>
-              <w:rPr>
-                <w:sz w:val="24"/>
-                <w:szCs w:val="24"/>
-              </w:rPr>
-            </w:pPr>
-            <w:r>
-              <w:rPr>
-                <w:b w:val="0"/>
-                <w:sz w:val="24"/>
-                <w:szCs w:val="24"/>
-              </w:rPr>
-              <w:t>Rekaman: SNX-OPS-FRM-01 dan SNX-OPS-FRM-02. Pelanggan proses: NOC dan SOC.</w:t>
+              <w:jc w:val="left"/>
+              <w:rPr>
+                <w:sz w:val="24"/>
+                <w:szCs w:val="24"/>
+              </w:rPr>
+            </w:pPr>
+            <w:r>
+              <w:rPr>
+                <w:b w:val="0"/>
+                <w:sz w:val="24"/>
+                <w:szCs w:val="24"/>
+              </w:rPr>
+              <w:t>Record: SNX-OPS-FRM-01 dan SNX-OPS-FRM-02. Pelanggan proses: NOC dan SOC.</w:t>
             </w:r>
           </w:p>
         </w:tc>
       </w:tr>
       <w:tr>
         <w:trPr>
+          <w:cantSplit/>
           <w:jc w:val="center"/>
         </w:trPr>
         <w:tc>
           <w:tcPr>
-            <w:tcW w:w="3367" w:type="dxa"/>
+            <w:tcW w:w="4309" w:type="dxa"/>
             <w:tcBorders>
               <w:top w:val="single" w:sz="8" w:space="0" w:color="000000"/>
               <w:left w:val="single" w:sz="8" w:space="0" w:color="000000"/>
@@ -5894,7 +6028,7 @@
         </w:tc>
         <w:tc>
           <w:tcPr>
-            <w:tcW w:w="2248" w:type="dxa"/>
+            <w:tcW w:w="1927" w:type="dxa"/>
             <w:tcBorders>
               <w:top w:val="single" w:sz="8" w:space="0" w:color="000000"/>
               <w:left w:val="single" w:sz="8" w:space="0" w:color="000000"/>
@@ -5922,7 +6056,7 @@
         </w:tc>
         <w:tc>
           <w:tcPr>
-            <w:tcW w:w="3913" w:type="dxa"/>
+            <w:tcW w:w="2835" w:type="dxa"/>
             <w:tcBorders>
               <w:top w:val="single" w:sz="8" w:space="0" w:color="000000"/>
               <w:left w:val="single" w:sz="8" w:space="0" w:color="000000"/>
@@ -5933,30 +6067,31 @@
           </w:tcPr>
           <w:p>
             <w:pPr>
-              <w:jc w:val="both"/>
-              <w:rPr>
-                <w:sz w:val="24"/>
-                <w:szCs w:val="24"/>
-              </w:rPr>
-            </w:pPr>
-            <w:r>
-              <w:rPr>
-                <w:b w:val="0"/>
-                <w:sz w:val="24"/>
-                <w:szCs w:val="24"/>
-              </w:rPr>
-              <w:t>Rekaman: SNX-OPS-FRM-03 dan SNX-OPS-FRM-04. Pelanggan proses: pelanggan, NOC, dan SOC.</w:t>
+              <w:jc w:val="left"/>
+              <w:rPr>
+                <w:sz w:val="24"/>
+                <w:szCs w:val="24"/>
+              </w:rPr>
+            </w:pPr>
+            <w:r>
+              <w:rPr>
+                <w:b w:val="0"/>
+                <w:sz w:val="24"/>
+                <w:szCs w:val="24"/>
+              </w:rPr>
+              <w:t>Record: SNX-OPS-FRM-03 dan SNX-OPS-FRM-04. Pelanggan proses: pelanggan, NOC, dan SOC.</w:t>
             </w:r>
           </w:p>
         </w:tc>
       </w:tr>
       <w:tr>
         <w:trPr>
+          <w:cantSplit/>
           <w:jc w:val="center"/>
         </w:trPr>
         <w:tc>
           <w:tcPr>
-            <w:tcW w:w="3367" w:type="dxa"/>
+            <w:tcW w:w="4309" w:type="dxa"/>
             <w:tcBorders>
               <w:top w:val="single" w:sz="8" w:space="0" w:color="000000"/>
               <w:left w:val="single" w:sz="8" w:space="0" w:color="000000"/>
@@ -5984,7 +6119,7 @@
         </w:tc>
         <w:tc>
           <w:tcPr>
-            <w:tcW w:w="2248" w:type="dxa"/>
+            <w:tcW w:w="1927" w:type="dxa"/>
             <w:tcBorders>
               <w:top w:val="single" w:sz="8" w:space="0" w:color="000000"/>
               <w:left w:val="single" w:sz="8" w:space="0" w:color="000000"/>
@@ -6012,7 +6147,7 @@
         </w:tc>
         <w:tc>
           <w:tcPr>
-            <w:tcW w:w="3913" w:type="dxa"/>
+            <w:tcW w:w="2835" w:type="dxa"/>
             <w:tcBorders>
               <w:top w:val="single" w:sz="8" w:space="0" w:color="000000"/>
               <w:left w:val="single" w:sz="8" w:space="0" w:color="000000"/>
@@ -6023,30 +6158,31 @@
           </w:tcPr>
           <w:p>
             <w:pPr>
-              <w:jc w:val="both"/>
-              <w:rPr>
-                <w:sz w:val="24"/>
-                <w:szCs w:val="24"/>
-              </w:rPr>
-            </w:pPr>
-            <w:r>
-              <w:rPr>
-                <w:b w:val="0"/>
-                <w:sz w:val="24"/>
-                <w:szCs w:val="24"/>
-              </w:rPr>
-              <w:t>Rekaman: SNX-OPS-FRM-05 dan SNX-OPS-FRM-06. Pelanggan proses: pelanggan dan Operation.</w:t>
+              <w:jc w:val="left"/>
+              <w:rPr>
+                <w:sz w:val="24"/>
+                <w:szCs w:val="24"/>
+              </w:rPr>
+            </w:pPr>
+            <w:r>
+              <w:rPr>
+                <w:b w:val="0"/>
+                <w:sz w:val="24"/>
+                <w:szCs w:val="24"/>
+              </w:rPr>
+              <w:t>Record: SNX-OPS-FRM-05 dan SNX-OPS-FRM-06. Pelanggan proses: pelanggan dan Operation.</w:t>
             </w:r>
           </w:p>
         </w:tc>
       </w:tr>
       <w:tr>
         <w:trPr>
+          <w:cantSplit/>
           <w:jc w:val="center"/>
         </w:trPr>
         <w:tc>
           <w:tcPr>
-            <w:tcW w:w="3367" w:type="dxa"/>
+            <w:tcW w:w="4309" w:type="dxa"/>
             <w:tcBorders>
               <w:top w:val="single" w:sz="8" w:space="0" w:color="000000"/>
               <w:left w:val="single" w:sz="8" w:space="0" w:color="000000"/>
@@ -6068,13 +6204,13 @@
                 <w:sz w:val="24"/>
                 <w:szCs w:val="24"/>
               </w:rPr>
-              <w:t>5. Operasi layanan 24/7: tangani alert dan tiket layanan BAU serta laksanakan maintenance bersama Lead NOC dan Lead SOC, mengikuti SNX-OPS-SOP-03, SNX-OPS-SOP-04, dan SNX-ISMS-SOP-01.</w:t>
-            </w:r>
-          </w:p>
-        </w:tc>
-        <w:tc>
-          <w:tcPr>
-            <w:tcW w:w="2248" w:type="dxa"/>
+              <w:t>5. Operasi layanan 24/7: tangani alert dan ticket layanan BAU serta laksanakan maintenance bersama Lead NOC dan Lead SOC, mengikuti SNX-OPS-SOP-03, SNX-OPS-SOP-04, dan SNX-ISMS-SOP-01.</w:t>
+            </w:r>
+          </w:p>
+        </w:tc>
+        <w:tc>
+          <w:tcPr>
+            <w:tcW w:w="1927" w:type="dxa"/>
             <w:tcBorders>
               <w:top w:val="single" w:sz="8" w:space="0" w:color="000000"/>
               <w:left w:val="single" w:sz="8" w:space="0" w:color="000000"/>
@@ -6102,7 +6238,7 @@
         </w:tc>
         <w:tc>
           <w:tcPr>
-            <w:tcW w:w="3913" w:type="dxa"/>
+            <w:tcW w:w="2835" w:type="dxa"/>
             <w:tcBorders>
               <w:top w:val="single" w:sz="8" w:space="0" w:color="000000"/>
               <w:left w:val="single" w:sz="8" w:space="0" w:color="000000"/>
@@ -6113,30 +6249,31 @@
           </w:tcPr>
           <w:p>
             <w:pPr>
-              <w:jc w:val="both"/>
-              <w:rPr>
-                <w:sz w:val="24"/>
-                <w:szCs w:val="24"/>
-              </w:rPr>
-            </w:pPr>
-            <w:r>
-              <w:rPr>
-                <w:b w:val="0"/>
-                <w:sz w:val="24"/>
-                <w:szCs w:val="24"/>
-              </w:rPr>
-              <w:t>Rekaman: SNX-OPS-FRM-07, SNX-OPS-FRM-08, dan SNX-ISMS-FRM-02. Pelanggan proses: pelanggan.</w:t>
+              <w:jc w:val="left"/>
+              <w:rPr>
+                <w:sz w:val="24"/>
+                <w:szCs w:val="24"/>
+              </w:rPr>
+            </w:pPr>
+            <w:r>
+              <w:rPr>
+                <w:b w:val="0"/>
+                <w:sz w:val="24"/>
+                <w:szCs w:val="24"/>
+              </w:rPr>
+              <w:t>Record: SNX-OPS-FRM-07, SNX-OPS-FRM-08, dan SNX-ISMS-FRM-02. Pelanggan proses: pelanggan.</w:t>
             </w:r>
           </w:p>
         </w:tc>
       </w:tr>
       <w:tr>
         <w:trPr>
+          <w:cantSplit/>
           <w:jc w:val="center"/>
         </w:trPr>
         <w:tc>
           <w:tcPr>
-            <w:tcW w:w="3367" w:type="dxa"/>
+            <w:tcW w:w="4309" w:type="dxa"/>
             <w:tcBorders>
               <w:top w:val="single" w:sz="8" w:space="0" w:color="000000"/>
               <w:left w:val="single" w:sz="8" w:space="0" w:color="000000"/>
@@ -6158,13 +6295,13 @@
                 <w:sz w:val="24"/>
                 <w:szCs w:val="24"/>
               </w:rPr>
-              <w:t>6. Pemantauan SLA: susun laporan SLA bulanan dari data monitoring dan tiket, mengikuti SNX-OPS-SOP-05.</w:t>
-            </w:r>
-          </w:p>
-        </w:tc>
-        <w:tc>
-          <w:tcPr>
-            <w:tcW w:w="2248" w:type="dxa"/>
+              <w:t>6. Pemantauan SLA: susun laporan SLA bulanan dari data monitoring dan ticket, mengikuti SNX-OPS-SOP-05.</w:t>
+            </w:r>
+          </w:p>
+        </w:tc>
+        <w:tc>
+          <w:tcPr>
+            <w:tcW w:w="1927" w:type="dxa"/>
             <w:tcBorders>
               <w:top w:val="single" w:sz="8" w:space="0" w:color="000000"/>
               <w:left w:val="single" w:sz="8" w:space="0" w:color="000000"/>
@@ -6192,7 +6329,7 @@
         </w:tc>
         <w:tc>
           <w:tcPr>
-            <w:tcW w:w="3913" w:type="dxa"/>
+            <w:tcW w:w="2835" w:type="dxa"/>
             <w:tcBorders>
               <w:top w:val="single" w:sz="8" w:space="0" w:color="000000"/>
               <w:left w:val="single" w:sz="8" w:space="0" w:color="000000"/>
@@ -6203,30 +6340,31 @@
           </w:tcPr>
           <w:p>
             <w:pPr>
-              <w:jc w:val="both"/>
-              <w:rPr>
-                <w:sz w:val="24"/>
-                <w:szCs w:val="24"/>
-              </w:rPr>
-            </w:pPr>
-            <w:r>
-              <w:rPr>
-                <w:b w:val="0"/>
-                <w:sz w:val="24"/>
-                <w:szCs w:val="24"/>
-              </w:rPr>
-              <w:t>Rekaman: SNX-OPS-FRM-09. Pelanggan proses: pelanggan dan manajemen.</w:t>
+              <w:jc w:val="left"/>
+              <w:rPr>
+                <w:sz w:val="24"/>
+                <w:szCs w:val="24"/>
+              </w:rPr>
+            </w:pPr>
+            <w:r>
+              <w:rPr>
+                <w:b w:val="0"/>
+                <w:sz w:val="24"/>
+                <w:szCs w:val="24"/>
+              </w:rPr>
+              <w:t>Record: SNX-OPS-FRM-09. Pelanggan proses: pelanggan dan manajemen.</w:t>
             </w:r>
           </w:p>
         </w:tc>
       </w:tr>
       <w:tr>
         <w:trPr>
+          <w:cantSplit/>
           <w:jc w:val="center"/>
         </w:trPr>
         <w:tc>
           <w:tcPr>
-            <w:tcW w:w="3367" w:type="dxa"/>
+            <w:tcW w:w="4309" w:type="dxa"/>
             <w:tcBorders>
               <w:top w:val="single" w:sz="8" w:space="0" w:color="000000"/>
               <w:left w:val="single" w:sz="8" w:space="0" w:color="000000"/>
@@ -6248,13 +6386,13 @@
                 <w:sz w:val="24"/>
                 <w:szCs w:val="24"/>
               </w:rPr>
-              <w:t>7. Pengukuran kinerja: susun laporan KPI dari laporan SLA, tiket, change, dan backup sebagai masukan tinjauan manajemen, mengikuti SNX-OPS-SOP-05.</w:t>
-            </w:r>
-          </w:p>
-        </w:tc>
-        <w:tc>
-          <w:tcPr>
-            <w:tcW w:w="2248" w:type="dxa"/>
+              <w:t>7. Pengukuran kinerja: susun laporan KPI dari laporan SLA, ticket, change, dan backup sebagai masukan Management Review, mengikuti SNX-OPS-SOP-05.</w:t>
+            </w:r>
+          </w:p>
+        </w:tc>
+        <w:tc>
+          <w:tcPr>
+            <w:tcW w:w="1927" w:type="dxa"/>
             <w:tcBorders>
               <w:top w:val="single" w:sz="8" w:space="0" w:color="000000"/>
               <w:left w:val="single" w:sz="8" w:space="0" w:color="000000"/>
@@ -6282,7 +6420,7 @@
         </w:tc>
         <w:tc>
           <w:tcPr>
-            <w:tcW w:w="3913" w:type="dxa"/>
+            <w:tcW w:w="2835" w:type="dxa"/>
             <w:tcBorders>
               <w:top w:val="single" w:sz="8" w:space="0" w:color="000000"/>
               <w:left w:val="single" w:sz="8" w:space="0" w:color="000000"/>
@@ -6293,30 +6431,31 @@
           </w:tcPr>
           <w:p>
             <w:pPr>
-              <w:jc w:val="both"/>
-              <w:rPr>
-                <w:sz w:val="24"/>
-                <w:szCs w:val="24"/>
-              </w:rPr>
-            </w:pPr>
-            <w:r>
-              <w:rPr>
-                <w:b w:val="0"/>
-                <w:sz w:val="24"/>
-                <w:szCs w:val="24"/>
-              </w:rPr>
-              <w:t>Rekaman: SNX-OPS-RPT-01. Pelanggan proses: COO dan manajemen.</w:t>
+              <w:jc w:val="left"/>
+              <w:rPr>
+                <w:sz w:val="24"/>
+                <w:szCs w:val="24"/>
+              </w:rPr>
+            </w:pPr>
+            <w:r>
+              <w:rPr>
+                <w:b w:val="0"/>
+                <w:sz w:val="24"/>
+                <w:szCs w:val="24"/>
+              </w:rPr>
+              <w:t>Record: SNX-OPS-RPT-01. Pelanggan proses: COO dan manajemen.</w:t>
             </w:r>
           </w:p>
         </w:tc>
       </w:tr>
       <w:tr>
         <w:trPr>
+          <w:cantSplit/>
           <w:jc w:val="center"/>
         </w:trPr>
         <w:tc>
           <w:tcPr>
-            <w:tcW w:w="3367" w:type="dxa"/>
+            <w:tcW w:w="4309" w:type="dxa"/>
             <w:tcBorders>
               <w:top w:val="single" w:sz="8" w:space="0" w:color="000000"/>
               <w:left w:val="single" w:sz="8" w:space="0" w:color="000000"/>
@@ -6338,13 +6477,13 @@
                 <w:sz w:val="24"/>
                 <w:szCs w:val="24"/>
               </w:rPr>
-              <w:t>8. Perbaikan: tetapkan RCA, tindakan korektif, dan pembaruan risiko dari insiden P1 dan P2, temuan audit, dan KPI di bawah target, mengikuti SNX-OPS-SOP-04.</w:t>
-            </w:r>
-          </w:p>
-        </w:tc>
-        <w:tc>
-          <w:tcPr>
-            <w:tcW w:w="2248" w:type="dxa"/>
+              <w:t>8. Perbaikan: tetapkan RCA, corrective action, dan pembaruan risiko dari insiden P1 dan P2, temuan audit, dan KPI di bawah target, mengikuti SNX-OPS-SOP-04.</w:t>
+            </w:r>
+          </w:p>
+        </w:tc>
+        <w:tc>
+          <w:tcPr>
+            <w:tcW w:w="1927" w:type="dxa"/>
             <w:tcBorders>
               <w:top w:val="single" w:sz="8" w:space="0" w:color="000000"/>
               <w:left w:val="single" w:sz="8" w:space="0" w:color="000000"/>
@@ -6372,7 +6511,7 @@
         </w:tc>
         <w:tc>
           <w:tcPr>
-            <w:tcW w:w="3913" w:type="dxa"/>
+            <w:tcW w:w="2835" w:type="dxa"/>
             <w:tcBorders>
               <w:top w:val="single" w:sz="8" w:space="0" w:color="000000"/>
               <w:left w:val="single" w:sz="8" w:space="0" w:color="000000"/>
@@ -6383,19 +6522,19 @@
           </w:tcPr>
           <w:p>
             <w:pPr>
-              <w:jc w:val="both"/>
-              <w:rPr>
-                <w:sz w:val="24"/>
-                <w:szCs w:val="24"/>
-              </w:rPr>
-            </w:pPr>
-            <w:r>
-              <w:rPr>
-                <w:b w:val="0"/>
-                <w:sz w:val="24"/>
-                <w:szCs w:val="24"/>
-              </w:rPr>
-              <w:t>Rekaman: SNX-OPS-FRM-10 dan SNX-ISMS-REG-02. Pelanggan proses: semua proses.</w:t>
+              <w:jc w:val="left"/>
+              <w:rPr>
+                <w:sz w:val="24"/>
+                <w:szCs w:val="24"/>
+              </w:rPr>
+            </w:pPr>
+            <w:r>
+              <w:rPr>
+                <w:b w:val="0"/>
+                <w:sz w:val="24"/>
+                <w:szCs w:val="24"/>
+              </w:rPr>
+              <w:t>Record: SNX-OPS-FRM-10 dan SNX-ISMS-REG-02. Pelanggan proses: semua proses.</w:t>
             </w:r>
           </w:p>
         </w:tc>
@@ -6440,6 +6579,7 @@
     </w:p>
     <w:p>
       <w:pPr>
+        <w:keepNext/>
         <w:pBdr>
           <w:top w:val="nil"/>
           <w:left w:val="nil"/>
@@ -6472,17 +6612,19 @@
         <w:tblLook w:val="0400" w:firstRow="0" w:lastRow="0" w:firstColumn="0" w:lastColumn="0" w:noHBand="0" w:noVBand="1"/>
       </w:tblPr>
       <w:tblGrid>
-        <w:gridCol w:w="3367"/>
-        <w:gridCol w:w="2248"/>
-        <w:gridCol w:w="3913"/>
+        <w:gridCol w:w="4309"/>
+        <w:gridCol w:w="1927"/>
+        <w:gridCol w:w="2835"/>
       </w:tblGrid>
       <w:tr>
         <w:trPr>
+          <w:cantSplit/>
+          <w:tblHeader/>
           <w:jc w:val="center"/>
         </w:trPr>
         <w:tc>
           <w:tcPr>
-            <w:tcW w:w="3367" w:type="dxa"/>
+            <w:tcW w:w="4309" w:type="dxa"/>
             <w:tcBorders>
               <w:top w:val="single" w:sz="8" w:space="0" w:color="000000"/>
               <w:left w:val="single" w:sz="8" w:space="0" w:color="000000"/>
@@ -6493,6 +6635,7 @@
           </w:tcPr>
           <w:p>
             <w:pPr>
+              <w:keepNext/>
               <w:jc w:val="center"/>
               <w:rPr>
                 <w:sz w:val="24"/>
@@ -6512,7 +6655,7 @@
         </w:tc>
         <w:tc>
           <w:tcPr>
-            <w:tcW w:w="2248" w:type="dxa"/>
+            <w:tcW w:w="1927" w:type="dxa"/>
             <w:tcBorders>
               <w:top w:val="single" w:sz="8" w:space="0" w:color="000000"/>
               <w:left w:val="single" w:sz="8" w:space="0" w:color="000000"/>
@@ -6523,6 +6666,7 @@
           </w:tcPr>
           <w:p>
             <w:pPr>
+              <w:keepNext/>
               <w:jc w:val="center"/>
               <w:rPr>
                 <w:sz w:val="24"/>
@@ -6542,7 +6686,7 @@
         </w:tc>
         <w:tc>
           <w:tcPr>
-            <w:tcW w:w="3913" w:type="dxa"/>
+            <w:tcW w:w="2835" w:type="dxa"/>
             <w:tcBorders>
               <w:top w:val="single" w:sz="8" w:space="0" w:color="000000"/>
               <w:left w:val="single" w:sz="8" w:space="0" w:color="000000"/>
@@ -6553,6 +6697,7 @@
           </w:tcPr>
           <w:p>
             <w:pPr>
+              <w:keepNext/>
               <w:jc w:val="center"/>
               <w:rPr>
                 <w:sz w:val="24"/>
@@ -6573,11 +6718,12 @@
       </w:tr>
       <w:tr>
         <w:trPr>
+          <w:cantSplit/>
           <w:jc w:val="center"/>
         </w:trPr>
         <w:tc>
           <w:tcPr>
-            <w:tcW w:w="3367" w:type="dxa"/>
+            <w:tcW w:w="4309" w:type="dxa"/>
             <w:tcBorders>
               <w:top w:val="single" w:sz="8" w:space="0" w:color="000000"/>
               <w:left w:val="single" w:sz="8" w:space="0" w:color="000000"/>
@@ -6599,13 +6745,13 @@
                 <w:sz w:val="24"/>
                 <w:szCs w:val="24"/>
               </w:rPr>
-              <w:t>1. Serahkan paket handover G1 ke SD dan PM sesudah PO atau kontrak ditandatangani.</w:t>
-            </w:r>
-          </w:p>
-        </w:tc>
-        <w:tc>
-          <w:tcPr>
-            <w:tcW w:w="2248" w:type="dxa"/>
+              <w:t>1. Serahkan paket handover G1 ke SD dan PM setelah PO atau kontrak ditandatangani.</w:t>
+            </w:r>
+          </w:p>
+        </w:tc>
+        <w:tc>
+          <w:tcPr>
+            <w:tcW w:w="1927" w:type="dxa"/>
             <w:tcBorders>
               <w:top w:val="single" w:sz="8" w:space="0" w:color="000000"/>
               <w:left w:val="single" w:sz="8" w:space="0" w:color="000000"/>
@@ -6633,7 +6779,7 @@
         </w:tc>
         <w:tc>
           <w:tcPr>
-            <w:tcW w:w="3913" w:type="dxa"/>
+            <w:tcW w:w="2835" w:type="dxa"/>
             <w:tcBorders>
               <w:top w:val="single" w:sz="8" w:space="0" w:color="000000"/>
               <w:left w:val="single" w:sz="8" w:space="0" w:color="000000"/>
@@ -6644,7 +6790,7 @@
           </w:tcPr>
           <w:p>
             <w:pPr>
-              <w:jc w:val="both"/>
+              <w:jc w:val="left"/>
               <w:rPr>
                 <w:sz w:val="24"/>
                 <w:szCs w:val="24"/>
@@ -6663,11 +6809,12 @@
       </w:tr>
       <w:tr>
         <w:trPr>
+          <w:cantSplit/>
           <w:jc w:val="center"/>
         </w:trPr>
         <w:tc>
           <w:tcPr>
-            <w:tcW w:w="3367" w:type="dxa"/>
+            <w:tcW w:w="4309" w:type="dxa"/>
             <w:tcBorders>
               <w:top w:val="single" w:sz="8" w:space="0" w:color="000000"/>
               <w:left w:val="single" w:sz="8" w:space="0" w:color="000000"/>
@@ -6689,13 +6836,13 @@
                 <w:sz w:val="24"/>
                 <w:szCs w:val="24"/>
               </w:rPr>
-              <w:t>2. Terima paket handover G1 bila Checklist G1 terpenuhi: PO atau kontrak, scope final, SLA tertulis, PIC pelanggan, dan janji lisan tercatat.</w:t>
-            </w:r>
-          </w:p>
-        </w:tc>
-        <w:tc>
-          <w:tcPr>
-            <w:tcW w:w="2248" w:type="dxa"/>
+              <w:t>2. Terima paket handover G1 jika Checklist G1 terpenuhi: PO atau kontrak, scope final, SLA tertulis, PIC pelanggan, dan janji lisan tercatat.</w:t>
+            </w:r>
+          </w:p>
+        </w:tc>
+        <w:tc>
+          <w:tcPr>
+            <w:tcW w:w="1927" w:type="dxa"/>
             <w:tcBorders>
               <w:top w:val="single" w:sz="8" w:space="0" w:color="000000"/>
               <w:left w:val="single" w:sz="8" w:space="0" w:color="000000"/>
@@ -6723,7 +6870,7 @@
         </w:tc>
         <w:tc>
           <w:tcPr>
-            <w:tcW w:w="3913" w:type="dxa"/>
+            <w:tcW w:w="2835" w:type="dxa"/>
             <w:tcBorders>
               <w:top w:val="single" w:sz="8" w:space="0" w:color="000000"/>
               <w:left w:val="single" w:sz="8" w:space="0" w:color="000000"/>
@@ -6734,7 +6881,7 @@
           </w:tcPr>
           <w:p>
             <w:pPr>
-              <w:jc w:val="both"/>
+              <w:jc w:val="left"/>
               <w:rPr>
                 <w:sz w:val="24"/>
                 <w:szCs w:val="24"/>
@@ -6753,11 +6900,12 @@
       </w:tr>
       <w:tr>
         <w:trPr>
+          <w:cantSplit/>
           <w:jc w:val="center"/>
         </w:trPr>
         <w:tc>
           <w:tcPr>
-            <w:tcW w:w="3367" w:type="dxa"/>
+            <w:tcW w:w="4309" w:type="dxa"/>
             <w:tcBorders>
               <w:top w:val="single" w:sz="8" w:space="0" w:color="000000"/>
               <w:left w:val="single" w:sz="8" w:space="0" w:color="000000"/>
@@ -6779,13 +6927,13 @@
                 <w:sz w:val="24"/>
                 <w:szCs w:val="24"/>
               </w:rPr>
-              <w:t>3. Nyatakan G2 lolos bila UAT lolos, BAST ditandatangani pelanggan, dan isu sisa punya pemilik.</w:t>
-            </w:r>
-          </w:p>
-        </w:tc>
-        <w:tc>
-          <w:tcPr>
-            <w:tcW w:w="2248" w:type="dxa"/>
+              <w:t>3. Nyatakan G2 lolos jika UAT lolos, BAST ditandatangani pelanggan, dan isu sisa punya pemilik.</w:t>
+            </w:r>
+          </w:p>
+        </w:tc>
+        <w:tc>
+          <w:tcPr>
+            <w:tcW w:w="1927" w:type="dxa"/>
             <w:tcBorders>
               <w:top w:val="single" w:sz="8" w:space="0" w:color="000000"/>
               <w:left w:val="single" w:sz="8" w:space="0" w:color="000000"/>
@@ -6813,7 +6961,7 @@
         </w:tc>
         <w:tc>
           <w:tcPr>
-            <w:tcW w:w="3913" w:type="dxa"/>
+            <w:tcW w:w="2835" w:type="dxa"/>
             <w:tcBorders>
               <w:top w:val="single" w:sz="8" w:space="0" w:color="000000"/>
               <w:left w:val="single" w:sz="8" w:space="0" w:color="000000"/>
@@ -6824,7 +6972,7 @@
           </w:tcPr>
           <w:p>
             <w:pPr>
-              <w:jc w:val="both"/>
+              <w:jc w:val="left"/>
               <w:rPr>
                 <w:sz w:val="24"/>
                 <w:szCs w:val="24"/>
@@ -6843,11 +6991,12 @@
       </w:tr>
       <w:tr>
         <w:trPr>
+          <w:cantSplit/>
           <w:jc w:val="center"/>
         </w:trPr>
         <w:tc>
           <w:tcPr>
-            <w:tcW w:w="3367" w:type="dxa"/>
+            <w:tcW w:w="4309" w:type="dxa"/>
             <w:tcBorders>
               <w:top w:val="single" w:sz="8" w:space="0" w:color="000000"/>
               <w:left w:val="single" w:sz="8" w:space="0" w:color="000000"/>
@@ -6869,13 +7018,13 @@
                 <w:sz w:val="24"/>
                 <w:szCs w:val="24"/>
               </w:rPr>
-              <w:t>4. Isi Checklist G3 dengan status tiap butir: aset terdaftar, monitoring aktif, backup dan restore teruji, as-built, runbook, dan akses lewat Jumphost.</w:t>
-            </w:r>
-          </w:p>
-        </w:tc>
-        <w:tc>
-          <w:tcPr>
-            <w:tcW w:w="2248" w:type="dxa"/>
+              <w:t>4. Isi Checklist G3 dengan status tiap butir: aset terdaftar, monitoring aktif, backup dan restore teruji, as-built, runbook, dan akses melalui Jumphost.</w:t>
+            </w:r>
+          </w:p>
+        </w:tc>
+        <w:tc>
+          <w:tcPr>
+            <w:tcW w:w="1927" w:type="dxa"/>
             <w:tcBorders>
               <w:top w:val="single" w:sz="8" w:space="0" w:color="000000"/>
               <w:left w:val="single" w:sz="8" w:space="0" w:color="000000"/>
@@ -6903,7 +7052,7 @@
         </w:tc>
         <w:tc>
           <w:tcPr>
-            <w:tcW w:w="3913" w:type="dxa"/>
+            <w:tcW w:w="2835" w:type="dxa"/>
             <w:tcBorders>
               <w:top w:val="single" w:sz="8" w:space="0" w:color="000000"/>
               <w:left w:val="single" w:sz="8" w:space="0" w:color="000000"/>
@@ -6914,7 +7063,7 @@
           </w:tcPr>
           <w:p>
             <w:pPr>
-              <w:jc w:val="both"/>
+              <w:jc w:val="left"/>
               <w:rPr>
                 <w:sz w:val="24"/>
                 <w:szCs w:val="24"/>
@@ -6933,11 +7082,12 @@
       </w:tr>
       <w:tr>
         <w:trPr>
+          <w:cantSplit/>
           <w:jc w:val="center"/>
         </w:trPr>
         <w:tc>
           <w:tcPr>
-            <w:tcW w:w="3367" w:type="dxa"/>
+            <w:tcW w:w="4309" w:type="dxa"/>
             <w:tcBorders>
               <w:top w:val="single" w:sz="8" w:space="0" w:color="000000"/>
               <w:left w:val="single" w:sz="8" w:space="0" w:color="000000"/>
@@ -6965,7 +7115,7 @@
         </w:tc>
         <w:tc>
           <w:tcPr>
-            <w:tcW w:w="2248" w:type="dxa"/>
+            <w:tcW w:w="1927" w:type="dxa"/>
             <w:tcBorders>
               <w:top w:val="single" w:sz="8" w:space="0" w:color="000000"/>
               <w:left w:val="single" w:sz="8" w:space="0" w:color="000000"/>
@@ -6993,7 +7143,7 @@
         </w:tc>
         <w:tc>
           <w:tcPr>
-            <w:tcW w:w="3913" w:type="dxa"/>
+            <w:tcW w:w="2835" w:type="dxa"/>
             <w:tcBorders>
               <w:top w:val="single" w:sz="8" w:space="0" w:color="000000"/>
               <w:left w:val="single" w:sz="8" w:space="0" w:color="000000"/>
@@ -7004,7 +7154,7 @@
           </w:tcPr>
           <w:p>
             <w:pPr>
-              <w:jc w:val="both"/>
+              <w:jc w:val="left"/>
               <w:rPr>
                 <w:sz w:val="24"/>
                 <w:szCs w:val="24"/>
@@ -7023,11 +7173,12 @@
       </w:tr>
       <w:tr>
         <w:trPr>
+          <w:cantSplit/>
           <w:jc w:val="center"/>
         </w:trPr>
         <w:tc>
           <w:tcPr>
-            <w:tcW w:w="3367" w:type="dxa"/>
+            <w:tcW w:w="4309" w:type="dxa"/>
             <w:tcBorders>
               <w:top w:val="single" w:sz="8" w:space="0" w:color="000000"/>
               <w:left w:val="single" w:sz="8" w:space="0" w:color="000000"/>
@@ -7049,13 +7200,13 @@
                 <w:sz w:val="24"/>
                 <w:szCs w:val="24"/>
               </w:rPr>
-              <w:t>6. Nyatakan G3 lolos bila semua butir Checklist G3 terpenuhi.</w:t>
-            </w:r>
-          </w:p>
-        </w:tc>
-        <w:tc>
-          <w:tcPr>
-            <w:tcW w:w="2248" w:type="dxa"/>
+              <w:t>6. Nyatakan G3 lolos jika semua butir Checklist G3 terpenuhi.</w:t>
+            </w:r>
+          </w:p>
+        </w:tc>
+        <w:tc>
+          <w:tcPr>
+            <w:tcW w:w="1927" w:type="dxa"/>
             <w:tcBorders>
               <w:top w:val="single" w:sz="8" w:space="0" w:color="000000"/>
               <w:left w:val="single" w:sz="8" w:space="0" w:color="000000"/>
@@ -7083,7 +7234,7 @@
         </w:tc>
         <w:tc>
           <w:tcPr>
-            <w:tcW w:w="3913" w:type="dxa"/>
+            <w:tcW w:w="2835" w:type="dxa"/>
             <w:tcBorders>
               <w:top w:val="single" w:sz="8" w:space="0" w:color="000000"/>
               <w:left w:val="single" w:sz="8" w:space="0" w:color="000000"/>
@@ -7094,7 +7245,7 @@
           </w:tcPr>
           <w:p>
             <w:pPr>
-              <w:jc w:val="both"/>
+              <w:jc w:val="left"/>
               <w:rPr>
                 <w:sz w:val="24"/>
                 <w:szCs w:val="24"/>
@@ -7139,6 +7290,7 @@
     <w:p>
       <w:pPr>
         <w:pStyle w:val="Heading2"/>
+        <w:keepNext/>
         <w:numPr>
           <w:ilvl w:val="1"/>
           <w:numId w:val="7"/>
@@ -7159,17 +7311,19 @@
         <w:tblLook w:val="0400" w:firstRow="0" w:lastRow="0" w:firstColumn="0" w:lastColumn="0" w:noHBand="0" w:noVBand="1"/>
       </w:tblPr>
       <w:tblGrid>
-        <w:gridCol w:w="3367"/>
-        <w:gridCol w:w="2248"/>
-        <w:gridCol w:w="3913"/>
+        <w:gridCol w:w="4309"/>
+        <w:gridCol w:w="1927"/>
+        <w:gridCol w:w="2835"/>
       </w:tblGrid>
       <w:tr>
         <w:trPr>
+          <w:cantSplit/>
+          <w:tblHeader/>
           <w:jc w:val="center"/>
         </w:trPr>
         <w:tc>
           <w:tcPr>
-            <w:tcW w:w="3367" w:type="dxa"/>
+            <w:tcW w:w="4309" w:type="dxa"/>
             <w:tcBorders>
               <w:top w:val="single" w:sz="8" w:space="0" w:color="000000"/>
               <w:left w:val="single" w:sz="8" w:space="0" w:color="000000"/>
@@ -7180,6 +7334,7 @@
           </w:tcPr>
           <w:p>
             <w:pPr>
+              <w:keepNext/>
               <w:jc w:val="center"/>
               <w:rPr>
                 <w:sz w:val="24"/>
@@ -7199,7 +7354,7 @@
         </w:tc>
         <w:tc>
           <w:tcPr>
-            <w:tcW w:w="2248" w:type="dxa"/>
+            <w:tcW w:w="1927" w:type="dxa"/>
             <w:tcBorders>
               <w:top w:val="single" w:sz="8" w:space="0" w:color="000000"/>
               <w:left w:val="single" w:sz="8" w:space="0" w:color="000000"/>
@@ -7210,6 +7365,7 @@
           </w:tcPr>
           <w:p>
             <w:pPr>
+              <w:keepNext/>
               <w:jc w:val="center"/>
               <w:rPr>
                 <w:sz w:val="24"/>
@@ -7229,7 +7385,7 @@
         </w:tc>
         <w:tc>
           <w:tcPr>
-            <w:tcW w:w="3913" w:type="dxa"/>
+            <w:tcW w:w="2835" w:type="dxa"/>
             <w:tcBorders>
               <w:top w:val="single" w:sz="8" w:space="0" w:color="000000"/>
               <w:left w:val="single" w:sz="8" w:space="0" w:color="000000"/>
@@ -7240,6 +7396,7 @@
           </w:tcPr>
           <w:p>
             <w:pPr>
+              <w:keepNext/>
               <w:jc w:val="center"/>
               <w:rPr>
                 <w:sz w:val="24"/>
@@ -7260,11 +7417,12 @@
       </w:tr>
       <w:tr>
         <w:trPr>
+          <w:cantSplit/>
           <w:jc w:val="center"/>
         </w:trPr>
         <w:tc>
           <w:tcPr>
-            <w:tcW w:w="3367" w:type="dxa"/>
+            <w:tcW w:w="4309" w:type="dxa"/>
             <w:tcBorders>
               <w:top w:val="single" w:sz="8" w:space="0" w:color="000000"/>
               <w:left w:val="single" w:sz="8" w:space="0" w:color="000000"/>
@@ -7292,7 +7450,7 @@
         </w:tc>
         <w:tc>
           <w:tcPr>
-            <w:tcW w:w="2248" w:type="dxa"/>
+            <w:tcW w:w="1927" w:type="dxa"/>
             <w:tcBorders>
               <w:top w:val="single" w:sz="8" w:space="0" w:color="000000"/>
               <w:left w:val="single" w:sz="8" w:space="0" w:color="000000"/>
@@ -7320,7 +7478,7 @@
         </w:tc>
         <w:tc>
           <w:tcPr>
-            <w:tcW w:w="3913" w:type="dxa"/>
+            <w:tcW w:w="2835" w:type="dxa"/>
             <w:tcBorders>
               <w:top w:val="single" w:sz="8" w:space="0" w:color="000000"/>
               <w:left w:val="single" w:sz="8" w:space="0" w:color="000000"/>
@@ -7331,7 +7489,7 @@
           </w:tcPr>
           <w:p>
             <w:pPr>
-              <w:jc w:val="both"/>
+              <w:jc w:val="left"/>
               <w:rPr>
                 <w:sz w:val="24"/>
                 <w:szCs w:val="24"/>
@@ -7350,11 +7508,12 @@
       </w:tr>
       <w:tr>
         <w:trPr>
+          <w:cantSplit/>
           <w:jc w:val="center"/>
         </w:trPr>
         <w:tc>
           <w:tcPr>
-            <w:tcW w:w="3367" w:type="dxa"/>
+            <w:tcW w:w="4309" w:type="dxa"/>
             <w:tcBorders>
               <w:top w:val="single" w:sz="8" w:space="0" w:color="000000"/>
               <w:left w:val="single" w:sz="8" w:space="0" w:color="000000"/>
@@ -7382,7 +7541,7 @@
         </w:tc>
         <w:tc>
           <w:tcPr>
-            <w:tcW w:w="2248" w:type="dxa"/>
+            <w:tcW w:w="1927" w:type="dxa"/>
             <w:tcBorders>
               <w:top w:val="single" w:sz="8" w:space="0" w:color="000000"/>
               <w:left w:val="single" w:sz="8" w:space="0" w:color="000000"/>
@@ -7410,7 +7569,7 @@
         </w:tc>
         <w:tc>
           <w:tcPr>
-            <w:tcW w:w="3913" w:type="dxa"/>
+            <w:tcW w:w="2835" w:type="dxa"/>
             <w:tcBorders>
               <w:top w:val="single" w:sz="8" w:space="0" w:color="000000"/>
               <w:left w:val="single" w:sz="8" w:space="0" w:color="000000"/>
@@ -7421,7 +7580,7 @@
           </w:tcPr>
           <w:p>
             <w:pPr>
-              <w:jc w:val="both"/>
+              <w:jc w:val="left"/>
               <w:rPr>
                 <w:sz w:val="24"/>
                 <w:szCs w:val="24"/>
@@ -7440,11 +7599,12 @@
       </w:tr>
       <w:tr>
         <w:trPr>
+          <w:cantSplit/>
           <w:jc w:val="center"/>
         </w:trPr>
         <w:tc>
           <w:tcPr>
-            <w:tcW w:w="3367" w:type="dxa"/>
+            <w:tcW w:w="4309" w:type="dxa"/>
             <w:tcBorders>
               <w:top w:val="single" w:sz="8" w:space="0" w:color="000000"/>
               <w:left w:val="single" w:sz="8" w:space="0" w:color="000000"/>
@@ -7472,7 +7632,7 @@
         </w:tc>
         <w:tc>
           <w:tcPr>
-            <w:tcW w:w="2248" w:type="dxa"/>
+            <w:tcW w:w="1927" w:type="dxa"/>
             <w:tcBorders>
               <w:top w:val="single" w:sz="8" w:space="0" w:color="000000"/>
               <w:left w:val="single" w:sz="8" w:space="0" w:color="000000"/>
@@ -7500,7 +7660,7 @@
         </w:tc>
         <w:tc>
           <w:tcPr>
-            <w:tcW w:w="3913" w:type="dxa"/>
+            <w:tcW w:w="2835" w:type="dxa"/>
             <w:tcBorders>
               <w:top w:val="single" w:sz="8" w:space="0" w:color="000000"/>
               <w:left w:val="single" w:sz="8" w:space="0" w:color="000000"/>
@@ -7511,7 +7671,7 @@
           </w:tcPr>
           <w:p>
             <w:pPr>
-              <w:jc w:val="both"/>
+              <w:jc w:val="left"/>
               <w:rPr>
                 <w:sz w:val="24"/>
                 <w:szCs w:val="24"/>
@@ -7530,11 +7690,12 @@
       </w:tr>
       <w:tr>
         <w:trPr>
+          <w:cantSplit/>
           <w:jc w:val="center"/>
         </w:trPr>
         <w:tc>
           <w:tcPr>
-            <w:tcW w:w="3367" w:type="dxa"/>
+            <w:tcW w:w="4309" w:type="dxa"/>
             <w:tcBorders>
               <w:top w:val="single" w:sz="8" w:space="0" w:color="000000"/>
               <w:left w:val="single" w:sz="8" w:space="0" w:color="000000"/>
@@ -7562,7 +7723,7 @@
         </w:tc>
         <w:tc>
           <w:tcPr>
-            <w:tcW w:w="2248" w:type="dxa"/>
+            <w:tcW w:w="1927" w:type="dxa"/>
             <w:tcBorders>
               <w:top w:val="single" w:sz="8" w:space="0" w:color="000000"/>
               <w:left w:val="single" w:sz="8" w:space="0" w:color="000000"/>
@@ -7590,7 +7751,7 @@
         </w:tc>
         <w:tc>
           <w:tcPr>
-            <w:tcW w:w="3913" w:type="dxa"/>
+            <w:tcW w:w="2835" w:type="dxa"/>
             <w:tcBorders>
               <w:top w:val="single" w:sz="8" w:space="0" w:color="000000"/>
               <w:left w:val="single" w:sz="8" w:space="0" w:color="000000"/>
@@ -7601,7 +7762,7 @@
           </w:tcPr>
           <w:p>
             <w:pPr>
-              <w:jc w:val="both"/>
+              <w:jc w:val="left"/>
               <w:rPr>
                 <w:sz w:val="24"/>
                 <w:szCs w:val="24"/>
@@ -7620,11 +7781,12 @@
       </w:tr>
       <w:tr>
         <w:trPr>
+          <w:cantSplit/>
           <w:jc w:val="center"/>
         </w:trPr>
         <w:tc>
           <w:tcPr>
-            <w:tcW w:w="3367" w:type="dxa"/>
+            <w:tcW w:w="4309" w:type="dxa"/>
             <w:tcBorders>
               <w:top w:val="single" w:sz="8" w:space="0" w:color="000000"/>
               <w:left w:val="single" w:sz="8" w:space="0" w:color="000000"/>
@@ -7646,13 +7808,13 @@
                 <w:sz w:val="24"/>
                 <w:szCs w:val="24"/>
               </w:rPr>
-              <w:t>5. Pimpin tinjauan manajemen yang membahas hasil pengukuran kinerja proses.</w:t>
-            </w:r>
-          </w:p>
-        </w:tc>
-        <w:tc>
-          <w:tcPr>
-            <w:tcW w:w="2248" w:type="dxa"/>
+              <w:t>5. Pimpin Management Review yang membahas hasil pengukuran kinerja proses.</w:t>
+            </w:r>
+          </w:p>
+        </w:tc>
+        <w:tc>
+          <w:tcPr>
+            <w:tcW w:w="1927" w:type="dxa"/>
             <w:tcBorders>
               <w:top w:val="single" w:sz="8" w:space="0" w:color="000000"/>
               <w:left w:val="single" w:sz="8" w:space="0" w:color="000000"/>
@@ -7680,7 +7842,7 @@
         </w:tc>
         <w:tc>
           <w:tcPr>
-            <w:tcW w:w="3913" w:type="dxa"/>
+            <w:tcW w:w="2835" w:type="dxa"/>
             <w:tcBorders>
               <w:top w:val="single" w:sz="8" w:space="0" w:color="000000"/>
               <w:left w:val="single" w:sz="8" w:space="0" w:color="000000"/>
@@ -7691,19 +7853,19 @@
           </w:tcPr>
           <w:p>
             <w:pPr>
-              <w:jc w:val="both"/>
-              <w:rPr>
-                <w:sz w:val="24"/>
-                <w:szCs w:val="24"/>
-              </w:rPr>
-            </w:pPr>
-            <w:r>
-              <w:rPr>
-                <w:b w:val="0"/>
-                <w:sz w:val="24"/>
-                <w:szCs w:val="24"/>
-              </w:rPr>
-              <w:t>Rekaman tinjauan manajemen</w:t>
+              <w:jc w:val="left"/>
+              <w:rPr>
+                <w:sz w:val="24"/>
+                <w:szCs w:val="24"/>
+              </w:rPr>
+            </w:pPr>
+            <w:r>
+              <w:rPr>
+                <w:b w:val="0"/>
+                <w:sz w:val="24"/>
+                <w:szCs w:val="24"/>
+              </w:rPr>
+              <w:t>Record hasil Management Review</w:t>
             </w:r>
           </w:p>
         </w:tc>
@@ -7829,7 +7991,7 @@
           <w:sz w:val="24"/>
           <w:szCs w:val="24"/>
         </w:rPr>
-        <w:t xml:space="preserve">Gambar 1. Alur proses inti Operation dengan gate G1 dan G3. Nama di bawah tiap kotak adalah pemilik proses atau pemilik gate. Garis putus-putus menunjukkan siklus perbaikan berkelanjutan: tindakan korektif kembali ke operasi layanan, dan perbaikan masuk ke kontrak dan rencana berikutnya.</w:t>
+        <w:t xml:space="preserve">Gambar 1. Alur proses inti Operation dengan gate G1 dan G3. Nama di bawah tiap kotak adalah pemilik proses atau pemilik gate. Garis putus-putus menunjukkan siklus perbaikan berkelanjutan: corrective action kembali ke operasi layanan, dan perbaikan masuk ke kontrak dan rencana berikutnya.</w:t>
       </w:r>
     </w:p>
     <w:p>
@@ -7864,6 +8026,7 @@
     <w:p>
       <w:pPr>
         <w:pStyle w:val="Heading1"/>
+        <w:keepNext/>
         <w:numPr>
           <w:ilvl w:val="0"/>
           <w:numId w:val="7"/>
@@ -7892,6 +8055,8 @@
       </w:tblGrid>
       <w:tr>
         <w:trPr>
+          <w:cantSplit/>
+          <w:tblHeader/>
           <w:jc w:val="center"/>
         </w:trPr>
         <w:tc>
@@ -7907,6 +8072,7 @@
           </w:tcPr>
           <w:p>
             <w:pPr>
+              <w:keepNext/>
               <w:jc w:val="center"/>
               <w:rPr>
                 <w:sz w:val="24"/>
@@ -7937,6 +8103,7 @@
           </w:tcPr>
           <w:p>
             <w:pPr>
+              <w:keepNext/>
               <w:jc w:val="center"/>
               <w:rPr>
                 <w:sz w:val="24"/>
@@ -7967,6 +8134,7 @@
           </w:tcPr>
           <w:p>
             <w:pPr>
+              <w:keepNext/>
               <w:jc w:val="center"/>
               <w:rPr>
                 <w:sz w:val="24"/>
@@ -7987,6 +8155,7 @@
       </w:tr>
       <w:tr>
         <w:trPr>
+          <w:cantSplit/>
           <w:jc w:val="center"/>
         </w:trPr>
         <w:tc>
@@ -8013,7 +8182,7 @@
                 <w:sz w:val="24"/>
                 <w:szCs w:val="24"/>
               </w:rPr>
-              <w:t>Kick-off internal sesudah PO atau kontrak ditandatangani</w:t>
+              <w:t>Kick-off internal setelah PO atau kontrak ditandatangani</w:t>
             </w:r>
           </w:p>
         </w:tc>
@@ -8058,7 +8227,7 @@
           </w:tcPr>
           <w:p>
             <w:pPr>
-              <w:jc w:val="both"/>
+              <w:jc w:val="left"/>
               <w:rPr>
                 <w:sz w:val="24"/>
                 <w:szCs w:val="24"/>
@@ -8077,6 +8246,7 @@
       </w:tr>
       <w:tr>
         <w:trPr>
+          <w:cantSplit/>
           <w:jc w:val="center"/>
         </w:trPr>
         <w:tc>
@@ -8148,7 +8318,7 @@
           </w:tcPr>
           <w:p>
             <w:pPr>
-              <w:jc w:val="both"/>
+              <w:jc w:val="left"/>
               <w:rPr>
                 <w:sz w:val="24"/>
                 <w:szCs w:val="24"/>
@@ -8167,6 +8337,7 @@
       </w:tr>
       <w:tr>
         <w:trPr>
+          <w:cantSplit/>
           <w:jc w:val="center"/>
         </w:trPr>
         <w:tc>
@@ -8238,7 +8409,7 @@
           </w:tcPr>
           <w:p>
             <w:pPr>
-              <w:jc w:val="both"/>
+              <w:jc w:val="left"/>
               <w:rPr>
                 <w:sz w:val="24"/>
                 <w:szCs w:val="24"/>
@@ -8257,6 +8428,7 @@
       </w:tr>
       <w:tr>
         <w:trPr>
+          <w:cantSplit/>
           <w:jc w:val="center"/>
         </w:trPr>
         <w:tc>
@@ -8328,7 +8500,7 @@
           </w:tcPr>
           <w:p>
             <w:pPr>
-              <w:jc w:val="both"/>
+              <w:jc w:val="left"/>
               <w:rPr>
                 <w:sz w:val="24"/>
                 <w:szCs w:val="24"/>
@@ -8347,6 +8519,7 @@
       </w:tr>
       <w:tr>
         <w:trPr>
+          <w:cantSplit/>
           <w:jc w:val="center"/>
         </w:trPr>
         <w:tc>
@@ -8373,7 +8546,7 @@
                 <w:sz w:val="24"/>
                 <w:szCs w:val="24"/>
               </w:rPr>
-              <w:t>Tinjauan dokumen ini</w:t>
+              <w:t>Review dokumen ini</w:t>
             </w:r>
           </w:p>
         </w:tc>
@@ -8418,7 +8591,7 @@
           </w:tcPr>
           <w:p>
             <w:pPr>
-              <w:jc w:val="both"/>
+              <w:jc w:val="left"/>
               <w:rPr>
                 <w:sz w:val="24"/>
                 <w:szCs w:val="24"/>
@@ -8447,6 +8620,7 @@
     <w:p>
       <w:pPr>
         <w:pStyle w:val="Heading1"/>
+        <w:keepNext/>
         <w:numPr>
           <w:ilvl w:val="0"/>
           <w:numId w:val="7"/>
@@ -8479,6 +8653,10 @@
         <w:gridCol w:w="6765"/>
       </w:tblGrid>
       <w:tr>
+        <w:trPr>
+          <w:cantSplit/>
+          <w:tblHeader/>
+        </w:trPr>
         <w:tc>
           <w:tcPr>
             <w:tcW w:w="2745" w:type="dxa"/>
@@ -8491,6 +8669,7 @@
           </w:tcPr>
           <w:p>
             <w:pPr>
+              <w:keepNext/>
               <w:spacing w:after="120" w:line="252" w:lineRule="auto"/>
               <w:rPr>
                 <w:sz w:val="24"/>
@@ -8519,8 +8698,9 @@
           </w:tcPr>
           <w:p>
             <w:pPr>
+              <w:keepNext/>
               <w:spacing w:after="120" w:line="252" w:lineRule="auto"/>
-              <w:jc w:val="both"/>
+              <w:jc w:val="left"/>
               <w:rPr>
                 <w:sz w:val="24"/>
                 <w:szCs w:val="24"/>
@@ -8538,6 +8718,9 @@
         </w:tc>
       </w:tr>
       <w:tr>
+        <w:trPr>
+          <w:cantSplit/>
+        </w:trPr>
         <w:tc>
           <w:tcPr>
             <w:tcW w:w="2745" w:type="dxa"/>
@@ -8579,24 +8762,27 @@
           <w:p>
             <w:pPr>
               <w:spacing w:after="120" w:line="252" w:lineRule="auto"/>
-              <w:jc w:val="both"/>
-              <w:rPr>
-                <w:sz w:val="24"/>
-                <w:szCs w:val="24"/>
-              </w:rPr>
-            </w:pPr>
-            <w:r>
-              <w:rPr>
-                <w:b w:val="0"/>
-                <w:sz w:val="24"/>
-                <w:szCs w:val="24"/>
-              </w:rPr>
-              <w:t>Service Delivery Manager mengembalikan paket ke VP Commercial dan mencatat kriteria yang belum terpenuhi di tiket. Onboarding belum dimulai.</w:t>
+              <w:jc w:val="left"/>
+              <w:rPr>
+                <w:sz w:val="24"/>
+                <w:szCs w:val="24"/>
+              </w:rPr>
+            </w:pPr>
+            <w:r>
+              <w:rPr>
+                <w:b w:val="0"/>
+                <w:sz w:val="24"/>
+                <w:szCs w:val="24"/>
+              </w:rPr>
+              <w:t>Service Delivery Manager mengembalikan paket ke VP Commercial dan mencatat kriteria yang belum terpenuhi di ticket. Onboarding belum dimulai.</w:t>
             </w:r>
           </w:p>
         </w:tc>
       </w:tr>
       <w:tr>
+        <w:trPr>
+          <w:cantSplit/>
+        </w:trPr>
         <w:tc>
           <w:tcPr>
             <w:tcW w:w="2745" w:type="dxa"/>
@@ -8638,24 +8824,27 @@
           <w:p>
             <w:pPr>
               <w:spacing w:after="120" w:line="252" w:lineRule="auto"/>
-              <w:jc w:val="both"/>
-              <w:rPr>
-                <w:sz w:val="24"/>
-                <w:szCs w:val="24"/>
-              </w:rPr>
-            </w:pPr>
-            <w:r>
-              <w:rPr>
-                <w:b w:val="0"/>
-                <w:sz w:val="24"/>
-                <w:szCs w:val="24"/>
-              </w:rPr>
-              <w:t>Head of Operation menolak serah terima secara tertulis dan mencatat kriteria yang belum terpenuhi, beserta pemilik dan tanggal targetnya, di tiket. Layanan tetap berstatus hypercare sampai kriteria terpenuhi, lalu Head of Operation memeriksa ulang G3.</w:t>
+              <w:jc w:val="left"/>
+              <w:rPr>
+                <w:sz w:val="24"/>
+                <w:szCs w:val="24"/>
+              </w:rPr>
+            </w:pPr>
+            <w:r>
+              <w:rPr>
+                <w:b w:val="0"/>
+                <w:sz w:val="24"/>
+                <w:szCs w:val="24"/>
+              </w:rPr>
+              <w:t>Head of Operation menolak serah terima secara tertulis, mencatat kriteria yang belum terpenuhi beserta pemilik dan tanggal targetnya di ticket, lalu memeriksa ulang G3 setelah kriteria terpenuhi. Selama itu layanan tetap berstatus hypercare.</w:t>
             </w:r>
           </w:p>
         </w:tc>
       </w:tr>
       <w:tr>
+        <w:trPr>
+          <w:cantSplit/>
+        </w:trPr>
         <w:tc>
           <w:tcPr>
             <w:tcW w:w="2745" w:type="dxa"/>
@@ -8697,7 +8886,7 @@
           <w:p>
             <w:pPr>
               <w:spacing w:after="120" w:line="252" w:lineRule="auto"/>
-              <w:jc w:val="both"/>
+              <w:jc w:val="left"/>
               <w:rPr>
                 <w:sz w:val="24"/>
                 <w:szCs w:val="24"/>
@@ -8715,6 +8904,9 @@
         </w:tc>
       </w:tr>
       <w:tr>
+        <w:trPr>
+          <w:cantSplit/>
+        </w:trPr>
         <w:tc>
           <w:tcPr>
             <w:tcW w:w="2745" w:type="dxa"/>
@@ -8739,7 +8931,7 @@
                 <w:sz w:val="24"/>
                 <w:szCs w:val="24"/>
               </w:rPr>
-              <w:t>Gate dilewati, rekaman tidak lengkap, atau SLA terlewat berulang</w:t>
+              <w:t>Gate dilewati, record tidak lengkap, atau SLA terlewat berulang</w:t>
             </w:r>
           </w:p>
         </w:tc>
@@ -8756,7 +8948,7 @@
           <w:p>
             <w:pPr>
               <w:spacing w:after="120" w:line="252" w:lineRule="auto"/>
-              <w:jc w:val="both"/>
+              <w:jc w:val="left"/>
               <w:rPr>
                 <w:sz w:val="24"/>
                 <w:szCs w:val="24"/>
@@ -8827,7 +9019,7 @@
           <w:sz w:val="24"/>
           <w:szCs w:val="24"/>
         </w:rPr>
-        <w:t xml:space="preserve">Kepatuhan terhadap alur ini diukur lewat SNX-OPS-RPT-01, dan ketidaksesuaian proses ditangani lewat SNX-OPS-FRM-10. Head of Operation meninjau dokumen ini setiap tahun.</w:t>
+        <w:t xml:space="preserve">Kepatuhan terhadap alur ini diukur melalui SNX-OPS-RPT-01, dan ketidaksesuaian proses ditangani melalui SNX-OPS-FRM-10. Head of Operation meninjau dokumen ini setiap tahun.</w:t>
       </w:r>
     </w:p>
     <w:p>
@@ -8879,6 +9071,7 @@
     </w:p>
     <w:p>
       <w:pPr>
+        <w:keepNext/>
         <w:pBdr>
           <w:top w:val="nil"/>
           <w:left w:val="nil"/>
@@ -8925,6 +9118,8 @@
       </w:tblGrid>
       <w:tr>
         <w:trPr>
+          <w:cantSplit/>
+          <w:tblHeader/>
           <w:jc w:val="center"/>
         </w:trPr>
         <w:tc>
@@ -8934,6 +9129,7 @@
           </w:tcPr>
           <w:p>
             <w:pPr>
+              <w:keepNext/>
               <w:jc w:val="center"/>
               <w:rPr>
                 <w:sz w:val="24"/>
@@ -8958,6 +9154,7 @@
           </w:tcPr>
           <w:p>
             <w:pPr>
+              <w:keepNext/>
               <w:jc w:val="center"/>
               <w:rPr>
                 <w:sz w:val="24"/>
@@ -8978,6 +9175,7 @@
       </w:tr>
       <w:tr>
         <w:trPr>
+          <w:cantSplit/>
           <w:jc w:val="center"/>
         </w:trPr>
         <w:tc>
@@ -9027,6 +9225,7 @@
       </w:tr>
       <w:tr>
         <w:trPr>
+          <w:cantSplit/>
           <w:jc w:val="center"/>
         </w:trPr>
         <w:tc>
@@ -9076,6 +9275,7 @@
       </w:tr>
       <w:tr>
         <w:trPr>
+          <w:cantSplit/>
           <w:jc w:val="center"/>
         </w:trPr>
         <w:tc>
@@ -9125,6 +9325,7 @@
       </w:tr>
       <w:tr>
         <w:trPr>
+          <w:cantSplit/>
           <w:jc w:val="center"/>
         </w:trPr>
         <w:tc>
@@ -9174,6 +9375,7 @@
       </w:tr>
       <w:tr>
         <w:trPr>
+          <w:cantSplit/>
           <w:jc w:val="center"/>
         </w:trPr>
         <w:tc>
@@ -9223,6 +9425,7 @@
       </w:tr>
       <w:tr>
         <w:trPr>
+          <w:cantSplit/>
           <w:jc w:val="center"/>
         </w:trPr>
         <w:tc>
@@ -9265,13 +9468,14 @@
                 <w:sz w:val="24"/>
                 <w:szCs w:val="24"/>
               </w:rPr>
-              <w:t>SOP Sales Process. Prosedur proses 1; penunjukan ini diusulkan di butir 6.1.</w:t>
+              <w:t>SOP Sales Process. Prosedur proses 1 (USULAN).</w:t>
             </w:r>
           </w:p>
         </w:tc>
       </w:tr>
       <w:tr>
         <w:trPr>
+          <w:cantSplit/>
           <w:jc w:val="center"/>
         </w:trPr>
         <w:tc>
@@ -9314,13 +9518,14 @@
                 <w:sz w:val="24"/>
                 <w:szCs w:val="24"/>
               </w:rPr>
-              <w:t>Project Plan, Scope &amp; Timeline Records. Rekaman proses 2 dan tempat Checklist G1.</w:t>
+              <w:t>Project Plan, Scope &amp; Timeline Records. Record proses 2 dan tempat Checklist G1.</w:t>
             </w:r>
           </w:p>
         </w:tc>
       </w:tr>
       <w:tr>
         <w:trPr>
+          <w:cantSplit/>
           <w:jc w:val="center"/>
         </w:trPr>
         <w:tc>
@@ -9363,13 +9568,14 @@
                 <w:sz w:val="24"/>
                 <w:szCs w:val="24"/>
               </w:rPr>
-              <w:t>Project Risk Register. Rekaman proses 2.</w:t>
+              <w:t>Project Risk Register. Record proses 2.</w:t>
             </w:r>
           </w:p>
         </w:tc>
       </w:tr>
       <w:tr>
         <w:trPr>
+          <w:cantSplit/>
           <w:jc w:val="center"/>
         </w:trPr>
         <w:tc>
@@ -9412,13 +9618,14 @@
                 <w:sz w:val="24"/>
                 <w:szCs w:val="24"/>
               </w:rPr>
-              <w:t>Project Progress &amp; Monitoring Report. Rekaman proses 3.</w:t>
+              <w:t>Project Progress &amp; Monitoring Report. Record proses 3.</w:t>
             </w:r>
           </w:p>
         </w:tc>
       </w:tr>
       <w:tr>
         <w:trPr>
+          <w:cantSplit/>
           <w:jc w:val="center"/>
         </w:trPr>
         <w:tc>
@@ -9461,13 +9668,14 @@
                 <w:sz w:val="24"/>
                 <w:szCs w:val="24"/>
               </w:rPr>
-              <w:t>Change Request &amp; Approval Log. Rekaman proses 3.</w:t>
+              <w:t>Change Request &amp; Approval Log. Record proses 3.</w:t>
             </w:r>
           </w:p>
         </w:tc>
       </w:tr>
       <w:tr>
         <w:trPr>
+          <w:cantSplit/>
           <w:jc w:val="center"/>
         </w:trPr>
         <w:tc>
@@ -9510,13 +9718,14 @@
                 <w:sz w:val="24"/>
                 <w:szCs w:val="24"/>
               </w:rPr>
-              <w:t>Testing / UAT &amp; Quality Verification Records. Rekaman proses 4 dan bukti G2.</w:t>
+              <w:t>Testing / UAT &amp; Quality Verification Records. Record proses 4 dan bukti G2.</w:t>
             </w:r>
           </w:p>
         </w:tc>
       </w:tr>
       <w:tr>
         <w:trPr>
+          <w:cantSplit/>
           <w:jc w:val="center"/>
         </w:trPr>
         <w:tc>
@@ -9559,13 +9768,14 @@
                 <w:sz w:val="24"/>
                 <w:szCs w:val="24"/>
               </w:rPr>
-              <w:t>Project Handover / BAST &amp; Closure Report. Rekaman proses 4, tempat BAST pada G2 dan Checklist G3.</w:t>
+              <w:t>Project Handover / BAST &amp; Closure Report. Record proses 4, tempat BAST pada G2 dan Checklist G3.</w:t>
             </w:r>
           </w:p>
         </w:tc>
       </w:tr>
       <w:tr>
         <w:trPr>
+          <w:cantSplit/>
           <w:jc w:val="center"/>
         </w:trPr>
         <w:tc>
@@ -9608,13 +9818,14 @@
                 <w:sz w:val="24"/>
                 <w:szCs w:val="24"/>
               </w:rPr>
-              <w:t>Maintenance Schedule &amp; Service Report. Rekaman proses 5.</w:t>
+              <w:t>Maintenance Schedule &amp; Service Report. Record proses 5.</w:t>
             </w:r>
           </w:p>
         </w:tc>
       </w:tr>
       <w:tr>
         <w:trPr>
+          <w:cantSplit/>
           <w:jc w:val="center"/>
         </w:trPr>
         <w:tc>
@@ -9657,13 +9868,14 @@
                 <w:sz w:val="24"/>
                 <w:szCs w:val="24"/>
               </w:rPr>
-              <w:t>Technical Ticket / Incident Register. Rekaman proses 5.</w:t>
+              <w:t>Technical Ticket / Incident Register. Record proses 5.</w:t>
             </w:r>
           </w:p>
         </w:tc>
       </w:tr>
       <w:tr>
         <w:trPr>
+          <w:cantSplit/>
           <w:jc w:val="center"/>
         </w:trPr>
         <w:tc>
@@ -9706,13 +9918,14 @@
                 <w:sz w:val="24"/>
                 <w:szCs w:val="24"/>
               </w:rPr>
-              <w:t>SLA Performance Monitoring Report. Rekaman proses 6.</w:t>
+              <w:t>SLA Performance Monitoring Report. Record proses 6.</w:t>
             </w:r>
           </w:p>
         </w:tc>
       </w:tr>
       <w:tr>
         <w:trPr>
+          <w:cantSplit/>
           <w:jc w:val="center"/>
         </w:trPr>
         <w:tc>
@@ -9755,13 +9968,14 @@
                 <w:sz w:val="24"/>
                 <w:szCs w:val="24"/>
               </w:rPr>
-              <w:t>Operations KPI &amp; Performance Monitoring Report. Rekaman proses 7 dan masukan tinjauan manajemen.</w:t>
+              <w:t>Operations KPI &amp; Performance Monitoring Report. Record proses 7 dan masukan Management Review.</w:t>
             </w:r>
           </w:p>
         </w:tc>
       </w:tr>
       <w:tr>
         <w:trPr>
+          <w:cantSplit/>
           <w:jc w:val="center"/>
         </w:trPr>
         <w:tc>
@@ -9804,13 +10018,14 @@
                 <w:sz w:val="24"/>
                 <w:szCs w:val="24"/>
               </w:rPr>
-              <w:t>Root Cause Analysis &amp; Corrective Action Report. Rekaman proses 8 dan penanganan ketidaksesuaian proses.</w:t>
+              <w:t>Root Cause Analysis &amp; Corrective Action Report. Record proses 8 dan penanganan ketidaksesuaian proses.</w:t>
             </w:r>
           </w:p>
         </w:tc>
       </w:tr>
       <w:tr>
         <w:trPr>
+          <w:cantSplit/>
           <w:jc w:val="center"/>
         </w:trPr>
         <w:tc>
@@ -9853,13 +10068,14 @@
                 <w:sz w:val="24"/>
                 <w:szCs w:val="24"/>
               </w:rPr>
-              <w:t>Information Classification &amp; Handling Procedure. Label dokumen proyek, BAST, laporan, dan rekaman operasi.</w:t>
+              <w:t>Information Classification &amp; Handling Procedure. Label dokumen proyek, BAST, laporan, dan record operasi.</w:t>
             </w:r>
           </w:p>
         </w:tc>
       </w:tr>
       <w:tr>
         <w:trPr>
+          <w:cantSplit/>
           <w:jc w:val="center"/>
         </w:trPr>
         <w:tc>
@@ -9909,6 +10125,7 @@
       </w:tr>
       <w:tr>
         <w:trPr>
+          <w:cantSplit/>
           <w:jc w:val="center"/>
         </w:trPr>
         <w:tc>
@@ -9951,13 +10168,14 @@
                 <w:sz w:val="24"/>
                 <w:szCs w:val="24"/>
               </w:rPr>
-              <w:t>SOP IT Asset &amp; Configuration Management. Inventaris aset dan konfigurasi; perubahan konfigurasi lewat SNX-OPS-SOP-02.</w:t>
+              <w:t>SOP IT Asset &amp; Configuration Management. Inventaris aset dan konfigurasi; perubahan konfigurasi melalui SNX-OPS-SOP-02.</w:t>
             </w:r>
           </w:p>
         </w:tc>
       </w:tr>
       <w:tr>
         <w:trPr>
+          <w:cantSplit/>
           <w:jc w:val="center"/>
         </w:trPr>
         <w:tc>
@@ -10000,13 +10218,14 @@
                 <w:sz w:val="24"/>
                 <w:szCs w:val="24"/>
               </w:rPr>
-              <w:t>Information Security Risk Assessment Register. Risiko proyek berat dan temuan RCA dinaikkan ke register risiko ISMS. Juga rekaman proses 8.</w:t>
+              <w:t>Information Security Risk Assessment Register. Record proses 8; risiko proyek berat dan temuan RCA dinaikkan ke register ini.</w:t>
             </w:r>
           </w:p>
         </w:tc>
       </w:tr>
       <w:tr>
         <w:trPr>
+          <w:cantSplit/>
           <w:jc w:val="center"/>
         </w:trPr>
         <w:tc>
@@ -10056,6 +10275,7 @@
       </w:tr>
       <w:tr>
         <w:trPr>
+          <w:cantSplit/>
           <w:jc w:val="center"/>
         </w:trPr>
         <w:tc>
@@ -10105,6 +10325,7 @@
       </w:tr>
       <w:tr>
         <w:trPr>
+          <w:cantSplit/>
           <w:jc w:val="center"/>
         </w:trPr>
         <w:tc>
@@ -10154,6 +10375,7 @@
       </w:tr>
       <w:tr>
         <w:trPr>
+          <w:cantSplit/>
           <w:jc w:val="center"/>
         </w:trPr>
         <w:tc>
@@ -10203,6 +10425,7 @@
       </w:tr>
       <w:tr>
         <w:trPr>
+          <w:cantSplit/>
           <w:jc w:val="center"/>
         </w:trPr>
         <w:tc>
@@ -10252,6 +10475,7 @@
       </w:tr>
       <w:tr>
         <w:trPr>
+          <w:cantSplit/>
           <w:jc w:val="center"/>
         </w:trPr>
         <w:tc>
@@ -10294,13 +10518,14 @@
                 <w:sz w:val="24"/>
                 <w:szCs w:val="24"/>
               </w:rPr>
-              <w:t>Backup Log &amp; Restore Testing Records. Rekaman proses backup dan pemulihan.</w:t>
+              <w:t>Backup Log &amp; Restore Testing Records. Record proses backup dan pemulihan.</w:t>
             </w:r>
           </w:p>
         </w:tc>
       </w:tr>
       <w:tr>
         <w:trPr>
+          <w:cantSplit/>
           <w:jc w:val="center"/>
         </w:trPr>
         <w:tc>
@@ -10350,6 +10575,7 @@
       </w:tr>
       <w:tr>
         <w:trPr>
+          <w:cantSplit/>
           <w:jc w:val="center"/>
         </w:trPr>
         <w:tc>
@@ -10399,6 +10625,7 @@
       </w:tr>
       <w:tr>
         <w:trPr>
+          <w:cantSplit/>
           <w:jc w:val="center"/>
         </w:trPr>
         <w:tc>
@@ -10441,13 +10668,14 @@
                 <w:sz w:val="24"/>
                 <w:szCs w:val="24"/>
               </w:rPr>
-              <w:t>Security Incident &amp; Investigation Records. Rekaman proses 5 dan penanganan insiden keamanan.</w:t>
+              <w:t>Security Incident &amp; Investigation Records. Record proses 5 dan penanganan insiden keamanan.</w:t>
             </w:r>
           </w:p>
         </w:tc>
       </w:tr>
       <w:tr>
         <w:trPr>
+          <w:cantSplit/>
           <w:jc w:val="center"/>
         </w:trPr>
         <w:tc>
@@ -10497,6 +10725,7 @@
       </w:tr>
       <w:tr>
         <w:trPr>
+          <w:cantSplit/>
           <w:jc w:val="center"/>
         </w:trPr>
         <w:tc>
@@ -10546,6 +10775,7 @@
       </w:tr>
       <w:tr>
         <w:trPr>
+          <w:cantSplit/>
           <w:jc w:val="center"/>
         </w:trPr>
         <w:tc>
@@ -10595,6 +10825,7 @@
       </w:tr>
       <w:tr>
         <w:trPr>
+          <w:cantSplit/>
           <w:jc w:val="center"/>
         </w:trPr>
         <w:tc>
@@ -10644,6 +10875,7 @@
       </w:tr>
       <w:tr>
         <w:trPr>
+          <w:cantSplit/>
           <w:jc w:val="center"/>
         </w:trPr>
         <w:tc>
@@ -10693,6 +10925,7 @@
       </w:tr>
       <w:tr>
         <w:trPr>
+          <w:cantSplit/>
           <w:jc w:val="center"/>
         </w:trPr>
         <w:tc>
@@ -10743,6 +10976,7 @@
     </w:tbl>
     <w:p>
       <w:pPr>
+        <w:keepNext/>
         <w:pBdr>
           <w:top w:val="nil"/>
           <w:left w:val="nil"/>
@@ -10782,6 +11016,8 @@
       </w:tblGrid>
       <w:tr>
         <w:trPr>
+          <w:cantSplit/>
+          <w:tblHeader/>
           <w:jc w:val="center"/>
         </w:trPr>
         <w:tc>
@@ -10797,6 +11033,7 @@
           </w:tcPr>
           <w:p>
             <w:pPr>
+              <w:keepNext/>
               <w:jc w:val="center"/>
               <w:rPr>
                 <w:sz w:val="24"/>
@@ -10827,6 +11064,7 @@
           </w:tcPr>
           <w:p>
             <w:pPr>
+              <w:keepNext/>
               <w:jc w:val="center"/>
               <w:rPr>
                 <w:sz w:val="24"/>
@@ -10857,6 +11095,7 @@
           </w:tcPr>
           <w:p>
             <w:pPr>
+              <w:keepNext/>
               <w:jc w:val="center"/>
               <w:rPr>
                 <w:sz w:val="24"/>
@@ -10877,6 +11116,7 @@
       </w:tr>
       <w:tr>
         <w:trPr>
+          <w:cantSplit/>
           <w:jc w:val="center"/>
         </w:trPr>
         <w:tc>
@@ -10948,7 +11188,7 @@
           </w:tcPr>
           <w:p>
             <w:pPr>
-              <w:jc w:val="both"/>
+              <w:jc w:val="left"/>
               <w:rPr>
                 <w:sz w:val="24"/>
                 <w:szCs w:val="24"/>
@@ -10967,6 +11207,7 @@
       </w:tr>
       <w:tr>
         <w:trPr>
+          <w:cantSplit/>
           <w:jc w:val="center"/>
         </w:trPr>
         <w:tc>
@@ -11038,25 +11279,26 @@
           </w:tcPr>
           <w:p>
             <w:pPr>
-              <w:jc w:val="both"/>
-              <w:rPr>
-                <w:sz w:val="24"/>
-                <w:szCs w:val="24"/>
-              </w:rPr>
-            </w:pPr>
-            <w:r>
-              <w:rPr>
-                <w:b w:val="0"/>
-                <w:sz w:val="24"/>
-                <w:szCs w:val="24"/>
-              </w:rPr>
-              <w:t>Mengikuti masa simpan di dokumen rekaman</w:t>
+              <w:jc w:val="left"/>
+              <w:rPr>
+                <w:sz w:val="24"/>
+                <w:szCs w:val="24"/>
+              </w:rPr>
+            </w:pPr>
+            <w:r>
+              <w:rPr>
+                <w:b w:val="0"/>
+                <w:sz w:val="24"/>
+                <w:szCs w:val="24"/>
+              </w:rPr>
+              <w:t>Mengikuti masa simpan di dokumen record</w:t>
             </w:r>
           </w:p>
         </w:tc>
       </w:tr>
       <w:tr>
         <w:trPr>
+          <w:cantSplit/>
           <w:jc w:val="center"/>
         </w:trPr>
         <w:tc>
@@ -11128,25 +11370,26 @@
           </w:tcPr>
           <w:p>
             <w:pPr>
-              <w:jc w:val="both"/>
-              <w:rPr>
-                <w:sz w:val="24"/>
-                <w:szCs w:val="24"/>
-              </w:rPr>
-            </w:pPr>
-            <w:r>
-              <w:rPr>
-                <w:b w:val="0"/>
-                <w:sz w:val="24"/>
-                <w:szCs w:val="24"/>
-              </w:rPr>
-              <w:t>Mengikuti masa simpan di dokumen rekaman</w:t>
+              <w:jc w:val="left"/>
+              <w:rPr>
+                <w:sz w:val="24"/>
+                <w:szCs w:val="24"/>
+              </w:rPr>
+            </w:pPr>
+            <w:r>
+              <w:rPr>
+                <w:b w:val="0"/>
+                <w:sz w:val="24"/>
+                <w:szCs w:val="24"/>
+              </w:rPr>
+              <w:t>Mengikuti masa simpan di dokumen record</w:t>
             </w:r>
           </w:p>
         </w:tc>
       </w:tr>
       <w:tr>
         <w:trPr>
+          <w:cantSplit/>
           <w:jc w:val="center"/>
         </w:trPr>
         <w:tc>
@@ -11218,25 +11461,26 @@
           </w:tcPr>
           <w:p>
             <w:pPr>
-              <w:jc w:val="both"/>
-              <w:rPr>
-                <w:sz w:val="24"/>
-                <w:szCs w:val="24"/>
-              </w:rPr>
-            </w:pPr>
-            <w:r>
-              <w:rPr>
-                <w:b w:val="0"/>
-                <w:sz w:val="24"/>
-                <w:szCs w:val="24"/>
-              </w:rPr>
-              <w:t>Mengikuti masa simpan di dokumen rekaman</w:t>
+              <w:jc w:val="left"/>
+              <w:rPr>
+                <w:sz w:val="24"/>
+                <w:szCs w:val="24"/>
+              </w:rPr>
+            </w:pPr>
+            <w:r>
+              <w:rPr>
+                <w:b w:val="0"/>
+                <w:sz w:val="24"/>
+                <w:szCs w:val="24"/>
+              </w:rPr>
+              <w:t>Mengikuti masa simpan di dokumen record</w:t>
             </w:r>
           </w:p>
         </w:tc>
       </w:tr>
       <w:tr>
         <w:trPr>
+          <w:cantSplit/>
           <w:jc w:val="center"/>
         </w:trPr>
         <w:tc>
@@ -11308,25 +11552,26 @@
           </w:tcPr>
           <w:p>
             <w:pPr>
-              <w:jc w:val="both"/>
-              <w:rPr>
-                <w:sz w:val="24"/>
-                <w:szCs w:val="24"/>
-              </w:rPr>
-            </w:pPr>
-            <w:r>
-              <w:rPr>
-                <w:b w:val="0"/>
-                <w:sz w:val="24"/>
-                <w:szCs w:val="24"/>
-              </w:rPr>
-              <w:t>Mengikuti masa simpan di dokumen rekaman</w:t>
+              <w:jc w:val="left"/>
+              <w:rPr>
+                <w:sz w:val="24"/>
+                <w:szCs w:val="24"/>
+              </w:rPr>
+            </w:pPr>
+            <w:r>
+              <w:rPr>
+                <w:b w:val="0"/>
+                <w:sz w:val="24"/>
+                <w:szCs w:val="24"/>
+              </w:rPr>
+              <w:t>Mengikuti masa simpan di dokumen record</w:t>
             </w:r>
           </w:p>
         </w:tc>
       </w:tr>
       <w:tr>
         <w:trPr>
+          <w:cantSplit/>
           <w:jc w:val="center"/>
         </w:trPr>
         <w:tc>
@@ -11398,25 +11643,26 @@
           </w:tcPr>
           <w:p>
             <w:pPr>
-              <w:jc w:val="both"/>
-              <w:rPr>
-                <w:sz w:val="24"/>
-                <w:szCs w:val="24"/>
-              </w:rPr>
-            </w:pPr>
-            <w:r>
-              <w:rPr>
-                <w:b w:val="0"/>
-                <w:sz w:val="24"/>
-                <w:szCs w:val="24"/>
-              </w:rPr>
-              <w:t>Mengikuti masa simpan di dokumen rekaman</w:t>
+              <w:jc w:val="left"/>
+              <w:rPr>
+                <w:sz w:val="24"/>
+                <w:szCs w:val="24"/>
+              </w:rPr>
+            </w:pPr>
+            <w:r>
+              <w:rPr>
+                <w:b w:val="0"/>
+                <w:sz w:val="24"/>
+                <w:szCs w:val="24"/>
+              </w:rPr>
+              <w:t>Mengikuti masa simpan di dokumen record</w:t>
             </w:r>
           </w:p>
         </w:tc>
       </w:tr>
       <w:tr>
         <w:trPr>
+          <w:cantSplit/>
           <w:jc w:val="center"/>
         </w:trPr>
         <w:tc>
@@ -11488,25 +11734,26 @@
           </w:tcPr>
           <w:p>
             <w:pPr>
-              <w:jc w:val="both"/>
-              <w:rPr>
-                <w:sz w:val="24"/>
-                <w:szCs w:val="24"/>
-              </w:rPr>
-            </w:pPr>
-            <w:r>
-              <w:rPr>
-                <w:b w:val="0"/>
-                <w:sz w:val="24"/>
-                <w:szCs w:val="24"/>
-              </w:rPr>
-              <w:t>Mengikuti masa simpan di dokumen rekaman</w:t>
+              <w:jc w:val="left"/>
+              <w:rPr>
+                <w:sz w:val="24"/>
+                <w:szCs w:val="24"/>
+              </w:rPr>
+            </w:pPr>
+            <w:r>
+              <w:rPr>
+                <w:b w:val="0"/>
+                <w:sz w:val="24"/>
+                <w:szCs w:val="24"/>
+              </w:rPr>
+              <w:t>Mengikuti masa simpan di dokumen record</w:t>
             </w:r>
           </w:p>
         </w:tc>
       </w:tr>
       <w:tr>
         <w:trPr>
+          <w:cantSplit/>
           <w:jc w:val="center"/>
         </w:trPr>
         <w:tc>
@@ -11578,25 +11825,26 @@
           </w:tcPr>
           <w:p>
             <w:pPr>
-              <w:jc w:val="both"/>
-              <w:rPr>
-                <w:sz w:val="24"/>
-                <w:szCs w:val="24"/>
-              </w:rPr>
-            </w:pPr>
-            <w:r>
-              <w:rPr>
-                <w:b w:val="0"/>
-                <w:sz w:val="24"/>
-                <w:szCs w:val="24"/>
-              </w:rPr>
-              <w:t>Mengikuti masa simpan di dokumen rekaman</w:t>
+              <w:jc w:val="left"/>
+              <w:rPr>
+                <w:sz w:val="24"/>
+                <w:szCs w:val="24"/>
+              </w:rPr>
+            </w:pPr>
+            <w:r>
+              <w:rPr>
+                <w:b w:val="0"/>
+                <w:sz w:val="24"/>
+                <w:szCs w:val="24"/>
+              </w:rPr>
+              <w:t>Mengikuti masa simpan di dokumen record</w:t>
             </w:r>
           </w:p>
         </w:tc>
       </w:tr>
       <w:tr>
         <w:trPr>
+          <w:cantSplit/>
           <w:jc w:val="center"/>
         </w:trPr>
         <w:tc>
@@ -11668,7 +11916,7 @@
           </w:tcPr>
           <w:p>
             <w:pPr>
-              <w:jc w:val="both"/>
+              <w:jc w:val="left"/>
               <w:rPr>
                 <w:sz w:val="24"/>
                 <w:szCs w:val="24"/>

</xml_diff>